<commit_message>
v0.6 proofreading: duplicate env row, cross-phase wording, BM25-baseline scope, BEIR reference
</commit_message>
<xml_diff>
--- a/manuscript_ipm/revision_v04/latex/manuscript.docx
+++ b/manuscript_ipm/revision_v04/latex/manuscript.docx
@@ -7262,7 +7262,7 @@
         <w:pStyle w:val="FirstParagraph"/>
       </w:pPr>
       <w:r>
-        <w:t xml:space="preserve">Some comparisons cross Phases 1 and 2: the Qwen–NQ cell against the new cells in the pooled model,</w:t>
+        <w:t xml:space="preserve">Some comparisons cross the software change between Phase 1 and the later phases: the Qwen–NQ cell against the new cells in the pooled model,</w:t>
       </w:r>
       <w:r>
         <w:t xml:space="preserve"> </w:t>
@@ -7299,7 +7299,7 @@
         <w:t xml:space="preserve"> </w:t>
       </w:r>
       <w:r>
-        <w:t xml:space="preserve">values, the reranker runs against the Phase 1 runs, and the Phase 3 runs of the Qwen reader against its Phase 1 sub-corpus runs. To check that the software change does not alter the reader, we compared Phases 1 and 2 on inputs that were identical by construction: the gold-only context of Phase 1 and the gold-only condition of the context experiment. Of 397 identical prompts, 396 produced identical outputs; the one difference was a shorter answer to the same question. A rerun of 100 prompts within one session gave 100/100 identical outputs.</w:t>
+        <w:t xml:space="preserve">values, the reranker runs against the Phase 1 runs, and the Phase 3 full-corpus runs of the Qwen reader against its Phase 1 sub-corpus runs. To check that the software change does not alter the reader, we compared Phases 1 and 2 on inputs that were identical by construction: the gold-only context of Phase 1 and the gold-only condition of the context experiment. Of 397 identical prompts, 396 produced identical outputs; the one difference was a shorter answer to the same question. A rerun of 100 prompts within one session gave 100/100 identical outputs.</w:t>
       </w:r>
     </w:p>
     <w:bookmarkEnd w:id="57"/>
@@ -12087,7 +12087,7 @@
         <w:t xml:space="preserve"> </w:t>
       </w:r>
       <w:r>
-        <w:t xml:space="preserve">was 0.233 [0.13, 0.33] with Qwen, inside its sub-corpus interval [0.147, 0.356], and 0.195 [0.09, 0.30] with Llama, inside [0.053, 0.265]. The paired differences from the sub-corpus ratios were −0.02 [−0.12, +0.09] and +0.04 [−0.06, +0.14]. The bge-small ratios were 0.15 [−0.12, 0.40] and 0.22 [−0.05, 0.48]; as on the sub-corpus, their intervals included zero. Every dense upper bound stayed below 1 (largest 0.483), so P7 and P8 were met for both readers. Against BM25, the dense ratios were 0.33–0.38 on the full corpus and 0.29–0.34 on the sub-corpus.</w:t>
+        <w:t xml:space="preserve">was 0.233 [0.13, 0.33] with Qwen, inside its sub-corpus interval [0.147, 0.356], and 0.195 [0.09, 0.30] with Llama, inside [0.053, 0.265]. The paired differences from the sub-corpus ratios were −0.02 [−0.12, +0.09] and +0.04 [−0.06, +0.14]. The bge-small ratios were 0.15 [−0.12, 0.40] and 0.22 [−0.05, 0.48]; as on the sub-corpus, their intervals included zero. Every dense upper bound stayed below 1 (largest 0.483), so P7 and P8 were met for both readers. Against BM25, the ratios of bge-small and e5-base-v2 were 0.33–0.38 on the full corpus and 0.29–0.34 on the sub-corpus.</w:t>
       </w:r>
     </w:p>
     <w:p>
@@ -23439,7 +23439,7 @@
         <w:t xml:space="preserve">)</w:t>
       </w:r>
       <w:r>
-        <w:t xml:space="preserve">; the F1 and containment ratios were higher but still well below 1. The sub-corpus inflates dense retrieval scores, but on the full corpus the order of four retrievers was kept, the e5-base-v2 ratios stayed inside their sub-corpus intervals for both readers, and the dense ratios against BM25 rose only from 0.29–0.34 to 0.33–0.38. This check covers three dense encoders on NQ; the larger encoders and HotpotQA were not run on a full corpus. Answer-bearing hard negatives did not explain the context effect either: P5 held, with a larger drop, on the questions whose hard negatives contained no answer string. The readers were 4-bit quantised 7–8B models with one prompt; stronger readers may convert hits into answers at a different rate. The ratio also depends on the baseline and on</w:t>
+        <w:t xml:space="preserve">; the F1 and containment ratios were higher but still well below 1. The sub-corpus inflates dense retrieval scores, but on the full corpus the order of four retrievers was kept, the e5-base-v2 ratios stayed inside their sub-corpus intervals for both readers, and the ratios of bge-small and e5-base-v2 against BM25 rose only from 0.29–0.34 to 0.33–0.38. This check covers three dense encoders on NQ; the larger encoders and HotpotQA were not run on a full corpus. Answer-bearing hard negatives did not explain the context effect either: P5 held, with a larger drop, on the questions whose hard negatives contained no answer string. The readers were 4-bit quantised 7–8B models with one prompt; stronger readers may convert hits into answers at a different rate. The ratio also depends on the baseline and on</w:t>
       </w:r>
       <w:r>
         <w:t xml:space="preserve"> </w:t>
@@ -25477,92 +25477,6 @@
             </w:pPr>
             <w:r>
               <w:t xml:space="preserve">2.1.3</w:t>
-            </w:r>
-          </w:p>
-        </w:tc>
-      </w:tr>
-      <w:tr>
-        <w:tc>
-          <w:tcPr/>
-          <w:p>
-            <w:pPr>
-              <w:pStyle w:val="Compact"/>
-              <w:jc w:val="left"/>
-            </w:pPr>
-            <w:r>
-              <w:t xml:space="preserve">Phase 1, NQ retrieval and encoding</w:t>
-            </w:r>
-          </w:p>
-        </w:tc>
-        <w:tc>
-          <w:tcPr/>
-          <w:p>
-            <w:pPr>
-              <w:pStyle w:val="Compact"/>
-              <w:jc w:val="left"/>
-            </w:pPr>
-            <w:r>
-              <w:t xml:space="preserve">3.12.13</w:t>
-            </w:r>
-          </w:p>
-        </w:tc>
-        <w:tc>
-          <w:tcPr/>
-          <w:p>
-            <w:pPr>
-              <w:pStyle w:val="Compact"/>
-              <w:jc w:val="left"/>
-            </w:pPr>
-            <w:r>
-              <w:t xml:space="preserve">2.10.0</w:t>
-            </w:r>
-          </w:p>
-        </w:tc>
-        <w:tc>
-          <w:tcPr/>
-          <w:p>
-            <w:pPr>
-              <w:pStyle w:val="Compact"/>
-              <w:jc w:val="left"/>
-            </w:pPr>
-            <w:r>
-              <w:t xml:space="preserve">12.8</w:t>
-            </w:r>
-          </w:p>
-        </w:tc>
-        <w:tc>
-          <w:tcPr/>
-          <w:p>
-            <w:pPr>
-              <w:pStyle w:val="Compact"/>
-              <w:jc w:val="left"/>
-            </w:pPr>
-            <w:r>
-              <w:t xml:space="preserve">5.0.0</w:t>
-            </w:r>
-          </w:p>
-        </w:tc>
-        <w:tc>
-          <w:tcPr/>
-          <w:p>
-            <w:pPr>
-              <w:pStyle w:val="Compact"/>
-              <w:jc w:val="left"/>
-            </w:pPr>
-            <w:r>
-              <w:t xml:space="preserve">–</w:t>
-            </w:r>
-          </w:p>
-        </w:tc>
-        <w:tc>
-          <w:tcPr/>
-          <w:p>
-            <w:pPr>
-              <w:pStyle w:val="Compact"/>
-              <w:jc w:val="left"/>
-            </w:pPr>
-            <w:r>
-              <w:t xml:space="preserve">2.0.2</w:t>
             </w:r>
           </w:p>
         </w:tc>
@@ -44820,7 +44734,7 @@
         <w:t xml:space="preserve">“</w:t>
       </w:r>
       <w:r>
-        <w:t xml:space="preserve">BEIR: A Heterogenous Benchmark for Zero-shot Evaluation of Information Retrieval Models</w:t>
+        <w:t xml:space="preserve">BEIR: A Heterogeneous Benchmark for Zero-shot Evaluation of Information Retrieval Models</w:t>
       </w:r>
       <w:r>
         <w:t xml:space="preserve">.”</w:t>
@@ -44829,7 +44743,20 @@
         <w:t xml:space="preserve"> </w:t>
       </w:r>
       <w:r>
-        <w:t xml:space="preserve">arXiv preprint arXiv:2104.08663.</w:t>
+        <w:t xml:space="preserve">In</w:t>
+      </w:r>
+      <w:r>
+        <w:t xml:space="preserve"> </w:t>
+      </w:r>
+      <w:r>
+        <w:rPr>
+          <w:iCs/>
+          <w:i/>
+        </w:rPr>
+        <w:t xml:space="preserve">Proceedings of the Neural Information Processing Systems Track on Datasets and Benchmarks</w:t>
+      </w:r>
+      <w:r>
+        <w:t xml:space="preserve">.</w:t>
       </w:r>
     </w:p>
     <w:bookmarkEnd w:id="245"/>

</xml_diff>

<commit_message>
v0.6: human audit of 100 misses (author labels) — results, Table humanaudit, text, records
</commit_message>
<xml_diff>
--- a/manuscript_ipm/revision_v04/latex/manuscript.docx
+++ b/manuscript_ipm/revision_v04/latex/manuscript.docx
@@ -663,13 +663,7 @@
         <w:t xml:space="preserve"> </w:t>
       </w:r>
       <w:r>
-        <w:t xml:space="preserve">Rerun</w:t>
-      </w:r>
-      <w:r>
-        <w:t xml:space="preserve"> </w:t>
-      </w:r>
-      <w:r>
-        <w:t xml:space="preserve">on</w:t>
+        <w:t xml:space="preserve">On</w:t>
       </w:r>
       <w:r>
         <w:t xml:space="preserve"> </w:t>
@@ -693,7 +687,37 @@
         <w:t xml:space="preserve"> </w:t>
       </w:r>
       <w:r>
-        <w:t xml:space="preserve">corpus</w:t>
+        <w:t xml:space="preserve">corpus,</w:t>
+      </w:r>
+      <w:r>
+        <w:t xml:space="preserve"> </w:t>
+      </w:r>
+      <w:r>
+        <w:t xml:space="preserve">the</w:t>
+      </w:r>
+      <w:r>
+        <w:t xml:space="preserve"> </w:t>
+      </w:r>
+      <w:r>
+        <w:t xml:space="preserve">dense</w:t>
+      </w:r>
+      <w:r>
+        <w:t xml:space="preserve"> </w:t>
+      </w:r>
+      <w:r>
+        <w:t xml:space="preserve">ratios</w:t>
+      </w:r>
+      <w:r>
+        <w:t xml:space="preserve"> </w:t>
+      </w:r>
+      <w:r>
+        <w:t xml:space="preserve">were</w:t>
+      </w:r>
+      <w:r>
+        <w:t xml:space="preserve"> </w:t>
+      </w:r>
+      <w:r>
+        <w:t xml:space="preserve">0.15–0.23</w:t>
       </w:r>
       <w:r>
         <w:t xml:space="preserve"> </w:t>
@@ -717,49 +741,13 @@
         <w:t xml:space="preserve"> </w:t>
       </w:r>
       <w:r>
-        <w:t xml:space="preserve">the</w:t>
-      </w:r>
-      <w:r>
-        <w:t xml:space="preserve"> </w:t>
-      </w:r>
-      <w:r>
-        <w:t xml:space="preserve">dense</w:t>
-      </w:r>
-      <w:r>
-        <w:t xml:space="preserve"> </w:t>
-      </w:r>
-      <w:r>
-        <w:t xml:space="preserve">ratios</w:t>
-      </w:r>
-      <w:r>
-        <w:t xml:space="preserve"> </w:t>
-      </w:r>
-      <w:r>
-        <w:t xml:space="preserve">were</w:t>
-      </w:r>
-      <w:r>
-        <w:t xml:space="preserve"> </w:t>
-      </w:r>
-      <w:r>
-        <w:t xml:space="preserve">0.15–0.23,</w:t>
-      </w:r>
-      <w:r>
-        <w:t xml:space="preserve"> </w:t>
-      </w:r>
-      <w:r>
         <w:t xml:space="preserve">and</w:t>
       </w:r>
       <w:r>
         <w:t xml:space="preserve"> </w:t>
       </w:r>
       <w:r>
-        <w:t xml:space="preserve">the</w:t>
-      </w:r>
-      <w:r>
-        <w:t xml:space="preserve"> </w:t>
-      </w:r>
-      <w:r>
-        <w:t xml:space="preserve">ratio</w:t>
+        <w:t xml:space="preserve">those</w:t>
       </w:r>
       <w:r>
         <w:t xml:space="preserve"> </w:t>
@@ -777,7 +765,7 @@
         <w:t xml:space="preserve"> </w:t>
       </w:r>
       <w:r>
-        <w:t xml:space="preserve">lay</w:t>
+        <w:t xml:space="preserve">stayed</w:t>
       </w:r>
       <w:r>
         <w:t xml:space="preserve"> </w:t>
@@ -789,7 +777,7 @@
         <w:t xml:space="preserve"> </w:t>
       </w:r>
       <w:r>
-        <w:t xml:space="preserve">its</w:t>
+        <w:t xml:space="preserve">their</w:t>
       </w:r>
       <w:r>
         <w:t xml:space="preserve"> </w:t>
@@ -801,7 +789,7 @@
         <w:t xml:space="preserve"> </w:t>
       </w:r>
       <w:r>
-        <w:t xml:space="preserve">interval.</w:t>
+        <w:t xml:space="preserve">intervals.</w:t>
       </w:r>
       <w:r>
         <w:t xml:space="preserve"> </w:t>
@@ -887,19 +875,13 @@
         <w:t xml:space="preserve"> </w:t>
       </w:r>
       <w:r>
-        <w:t xml:space="preserve">but</w:t>
-      </w:r>
-      <w:r>
-        <w:t xml:space="preserve"> </w:t>
-      </w:r>
-      <w:r>
-        <w:t xml:space="preserve">was</w:t>
-      </w:r>
-      <w:r>
-        <w:t xml:space="preserve"> </w:t>
-      </w:r>
-      <w:r>
-        <w:t xml:space="preserve">higher</w:t>
+        <w:t xml:space="preserve">and</w:t>
+      </w:r>
+      <w:r>
+        <w:t xml:space="preserve"> </w:t>
+      </w:r>
+      <w:r>
+        <w:t xml:space="preserve">rose</w:t>
       </w:r>
       <w:r>
         <w:t xml:space="preserve"> </w:t>
@@ -1061,7 +1043,61 @@
         <w:t xml:space="preserve"> </w:t>
       </w:r>
       <w:r>
-        <w:t xml:space="preserve">0.41–0.55</w:t>
+        <w:t xml:space="preserve">a</w:t>
+      </w:r>
+      <w:r>
+        <w:t xml:space="preserve"> </w:t>
+      </w:r>
+      <w:r>
+        <w:t xml:space="preserve">blinded</w:t>
+      </w:r>
+      <w:r>
+        <w:t xml:space="preserve"> </w:t>
+      </w:r>
+      <w:r>
+        <w:t xml:space="preserve">audit</w:t>
+      </w:r>
+      <w:r>
+        <w:t xml:space="preserve"> </w:t>
+      </w:r>
+      <w:r>
+        <w:t xml:space="preserve">found</w:t>
+      </w:r>
+      <w:r>
+        <w:t xml:space="preserve"> </w:t>
+      </w:r>
+      <w:r>
+        <w:t xml:space="preserve">a</w:t>
+      </w:r>
+      <w:r>
+        <w:t xml:space="preserve"> </w:t>
+      </w:r>
+      <w:r>
+        <w:t xml:space="preserve">correct</w:t>
+      </w:r>
+      <w:r>
+        <w:t xml:space="preserve"> </w:t>
+      </w:r>
+      <w:r>
+        <w:t xml:space="preserve">answer</w:t>
+      </w:r>
+      <w:r>
+        <w:t xml:space="preserve"> </w:t>
+      </w:r>
+      <w:r>
+        <w:t xml:space="preserve">in</w:t>
+      </w:r>
+      <w:r>
+        <w:t xml:space="preserve"> </w:t>
+      </w:r>
+      <w:r>
+        <w:t xml:space="preserve">the</w:t>
+      </w:r>
+      <w:r>
+        <w:t xml:space="preserve"> </w:t>
+      </w:r>
+      <w:r>
+        <w:t xml:space="preserve">passages</w:t>
       </w:r>
       <w:r>
         <w:t xml:space="preserve"> </w:t>
@@ -1073,49 +1109,25 @@
         <w:t xml:space="preserve"> </w:t>
       </w:r>
       <w:r>
-        <w:t xml:space="preserve">dense-encoder</w:t>
-      </w:r>
-      <w:r>
-        <w:t xml:space="preserve"> </w:t>
-      </w:r>
-      <w:r>
-        <w:t xml:space="preserve">Hit@5</w:t>
-      </w:r>
-      <w:r>
-        <w:t xml:space="preserve"> </w:t>
-      </w:r>
-      <w:r>
-        <w:t xml:space="preserve">misses</w:t>
-      </w:r>
-      <w:r>
-        <w:t xml:space="preserve"> </w:t>
-      </w:r>
-      <w:r>
-        <w:t xml:space="preserve">still</w:t>
-      </w:r>
-      <w:r>
-        <w:t xml:space="preserve"> </w:t>
-      </w:r>
-      <w:r>
-        <w:t xml:space="preserve">contained</w:t>
-      </w:r>
-      <w:r>
-        <w:t xml:space="preserve"> </w:t>
-      </w:r>
-      <w:r>
-        <w:t xml:space="preserve">an</w:t>
-      </w:r>
-      <w:r>
-        <w:t xml:space="preserve"> </w:t>
-      </w:r>
-      <w:r>
-        <w:t xml:space="preserve">answer</w:t>
-      </w:r>
-      <w:r>
-        <w:t xml:space="preserve"> </w:t>
-      </w:r>
-      <w:r>
-        <w:t xml:space="preserve">string.</w:t>
+        <w:t xml:space="preserve">41</w:t>
+      </w:r>
+      <w:r>
+        <w:t xml:space="preserve"> </w:t>
+      </w:r>
+      <w:r>
+        <w:t xml:space="preserve">of</w:t>
+      </w:r>
+      <w:r>
+        <w:t xml:space="preserve"> </w:t>
+      </w:r>
+      <w:r>
+        <w:t xml:space="preserve">100</w:t>
+      </w:r>
+      <w:r>
+        <w:t xml:space="preserve"> </w:t>
+      </w:r>
+      <w:r>
+        <w:t xml:space="preserve">misses.</w:t>
       </w:r>
       <w:r>
         <w:t xml:space="preserve"> </w:t>
@@ -3260,7 +3272,7 @@
     </w:p>
     <w:bookmarkEnd w:id="25"/>
     <w:bookmarkEnd w:id="26"/>
-    <w:bookmarkStart w:id="55" w:name="sec:method"/>
+    <w:bookmarkStart w:id="56" w:name="sec:method"/>
     <w:p>
       <w:pPr>
         <w:pStyle w:val="Heading1"/>
@@ -5606,7 +5618,7 @@
           <w:rPr>
             <w:rStyle w:val="Hyperlink"/>
           </w:rPr>
-          <w:t xml:space="preserve">10</w:t>
+          <w:t xml:space="preserve">11</w:t>
         </w:r>
       </w:hyperlink>
       <w:r>
@@ -6798,7 +6810,7 @@
       </w:r>
     </w:p>
     <w:bookmarkEnd w:id="44"/>
-    <w:bookmarkStart w:id="54" w:name="sec:extra"/>
+    <w:bookmarkStart w:id="55" w:name="sec:extra"/>
     <w:p>
       <w:pPr>
         <w:pStyle w:val="Heading2"/>
@@ -7080,13 +7092,13 @@
       </w:r>
     </w:p>
     <w:bookmarkEnd w:id="51"/>
-    <w:bookmarkStart w:id="52" w:name="retrieval-stage-cost-e7"/>
+    <w:bookmarkStart w:id="52" w:name="human-audit-of-misses-phase-3"/>
     <w:p>
       <w:pPr>
         <w:pStyle w:val="Heading4"/>
       </w:pPr>
       <w:r>
-        <w:t xml:space="preserve">Retrieval-stage cost (E7)</w:t>
+        <w:t xml:space="preserve">Human audit of misses (Phase 3)</w:t>
       </w:r>
     </w:p>
     <w:p>
@@ -7094,11 +7106,29 @@
         <w:pStyle w:val="FirstParagraph"/>
       </w:pPr>
       <w:r>
-        <w:t xml:space="preserve">For each encoder we measured passage-encoding throughput on 20,000 passages (batch 128, after warm-up, with GPU synchronisation) and batch-1 query-encoding latency on 500 queries, five times in one session.</w:t>
+        <w:t xml:space="preserve">From the sub-corpus Hit@5 misses of e5-base-v2 among the NQ generation queries, 100 were drawn with a seed fixed in the Phase 3 design. The author saw the question, the reference answers and the five passages, and labelled whether any passage contains a correct answer (yes, no or unsure), which one, and whether that passage is about the question’s subject. Only after all 100 were labelled did a second screen show the Qwen reader’s answer, labelled as factually correct or not and, for correct answers with EM 0, whether the difference was only an alias or formatting. The gold passage and the automatic flag were not shown, and no AI labels were used. Results are counts with Wilson 95% intervals.</w:t>
       </w:r>
     </w:p>
     <w:bookmarkEnd w:id="52"/>
-    <w:bookmarkStart w:id="53" w:name="judge-validation-e3"/>
+    <w:bookmarkStart w:id="53" w:name="retrieval-stage-cost-e7"/>
+    <w:p>
+      <w:pPr>
+        <w:pStyle w:val="Heading4"/>
+      </w:pPr>
+      <w:r>
+        <w:t xml:space="preserve">Retrieval-stage cost (E7)</w:t>
+      </w:r>
+    </w:p>
+    <w:p>
+      <w:pPr>
+        <w:pStyle w:val="FirstParagraph"/>
+      </w:pPr>
+      <w:r>
+        <w:t xml:space="preserve">For each encoder we measured passage-encoding throughput on 20,000 passages (batch 128, after warm-up, with GPU synchronisation) and batch-1 query-encoding latency on 500 queries, five times in one session.</w:t>
+      </w:r>
+    </w:p>
+    <w:bookmarkEnd w:id="53"/>
+    <w:bookmarkStart w:id="54" w:name="judge-validation-e3"/>
     <w:p>
       <w:pPr>
         <w:pStyle w:val="Heading4"/>
@@ -7204,10 +7234,10 @@
         <w:t xml:space="preserve">.</w:t>
       </w:r>
     </w:p>
-    <w:bookmarkEnd w:id="53"/>
     <w:bookmarkEnd w:id="54"/>
     <w:bookmarkEnd w:id="55"/>
-    <w:bookmarkStart w:id="61" w:name="sec:setup"/>
+    <w:bookmarkEnd w:id="56"/>
+    <w:bookmarkStart w:id="62" w:name="sec:setup"/>
     <w:p>
       <w:pPr>
         <w:pStyle w:val="Heading1"/>
@@ -7216,7 +7246,7 @@
         <w:t xml:space="preserve">Experimental setup</w:t>
       </w:r>
     </w:p>
-    <w:bookmarkStart w:id="56" w:name="hardware-and-software"/>
+    <w:bookmarkStart w:id="57" w:name="hardware-and-software"/>
     <w:p>
       <w:pPr>
         <w:pStyle w:val="Heading4"/>
@@ -7247,8 +7277,8 @@
         <w:t xml:space="preserve">lists the software of every session as its environment log recorded it.</w:t>
       </w:r>
     </w:p>
-    <w:bookmarkEnd w:id="56"/>
-    <w:bookmarkStart w:id="57" w:name="determinism-across-phases"/>
+    <w:bookmarkEnd w:id="57"/>
+    <w:bookmarkStart w:id="58" w:name="determinism-across-phases"/>
     <w:p>
       <w:pPr>
         <w:pStyle w:val="Heading4"/>
@@ -7302,8 +7332,8 @@
         <w:t xml:space="preserve">values, the reranker runs against the Phase 1 runs, and the Phase 3 full-corpus runs of the Qwen reader against its Phase 1 sub-corpus runs. To check that the software change does not alter the reader, we compared Phases 1 and 2 on inputs that were identical by construction: the gold-only context of Phase 1 and the gold-only condition of the context experiment. Of 397 identical prompts, 396 produced identical outputs; the one difference was a shorter answer to the same question. A rerun of 100 prompts within one session gave 100/100 identical outputs.</w:t>
       </w:r>
     </w:p>
-    <w:bookmarkEnd w:id="57"/>
-    <w:bookmarkStart w:id="58" w:name="seeds-and-repetitions"/>
+    <w:bookmarkEnd w:id="58"/>
+    <w:bookmarkStart w:id="59" w:name="seeds-and-repetitions"/>
     <w:p>
       <w:pPr>
         <w:pStyle w:val="Heading4"/>
@@ -7320,8 +7350,8 @@
         <w:t xml:space="preserve">The query order (seed 20260926), bootstrap (seed 0), decoding (greedy, seed 0) and the random passages of the context experiment were fixed. Retrieval and greedy decoding are deterministic within a session, so we ran each answer condition once. The cost measurements were repeated five times.</w:t>
       </w:r>
     </w:p>
-    <w:bookmarkEnd w:id="58"/>
-    <w:bookmarkStart w:id="59" w:name="analysis-and-verification"/>
+    <w:bookmarkEnd w:id="59"/>
+    <w:bookmarkStart w:id="60" w:name="analysis-and-verification"/>
     <w:p>
       <w:pPr>
         <w:pStyle w:val="Heading4"/>
@@ -7349,8 +7379,8 @@
         <w:t xml:space="preserve">. It found no disagreement. Bootstrap intervals, F1, answer containment and the pooled model were not re-implemented independently. Phase 3 has its own analysis script, which also reads only committed outputs. It checks that the passages each reader saw equal the top five of the stored ranked lists, and that the sub-corpus intervals it recomputes equal the committed ones. Re-encoding the full corpus gave Hit@5 and nDCG@10 values identical to those of the earlier full-corpus check (E9) for all four retrievers. A second script, again written without the project code, re-scored all 18,040 Phase 3 answers from the raw reader outputs and recomputed the means, ratios with their intervals, McNemar tests, query-level contributions and the answer-string shares of MiniLM-L6 and e5-base-v2; it found no disagreement.</w:t>
       </w:r>
     </w:p>
-    <w:bookmarkEnd w:id="59"/>
-    <w:bookmarkStart w:id="60" w:name="sec:deviations"/>
+    <w:bookmarkEnd w:id="60"/>
+    <w:bookmarkStart w:id="61" w:name="sec:deviations"/>
     <w:p>
       <w:pPr>
         <w:pStyle w:val="Heading2"/>
@@ -7392,7 +7422,7 @@
           <w:rPr>
             <w:rStyle w:val="Hyperlink"/>
           </w:rPr>
-          <w:t xml:space="preserve">7</w:t>
+          <w:t xml:space="preserve">8</w:t>
         </w:r>
       </w:hyperlink>
       <w:r>
@@ -7543,7 +7573,7 @@
         <w:t xml:space="preserve"> </w:t>
       </w:r>
       <w:r>
-        <w:t xml:space="preserve">The Phase 3 design adds a blinded audit of 100 seeded e5-base-v2 retrieval misses by the author. Its labels were not complete when this version was written, so it is not reported. The Phase 3 session itself ran as registered, with no failed run.</w:t>
+        <w:t xml:space="preserve">The audit ran as registered, with one change of tool: the author labelled the items in a web page instead of the planned spreadsheet, because the spreadsheet’s selection lists did not work on the author’s computer. The page showed the same items in the same order, showed neither the gold passage nor the automatic flag, and opened the reader’s answers only after all 100 passage labels were complete. Passage labels could still be changed after that point, and the export records only the time of each item’s last change. The Phase 3 session itself ran as registered, with no failed run.</w:t>
       </w:r>
     </w:p>
     <w:p>
@@ -7554,9 +7584,9 @@
         <w:t xml:space="preserve">No run was repeated to obtain a different result, and no result was discarded.</w:t>
       </w:r>
     </w:p>
-    <w:bookmarkEnd w:id="60"/>
     <w:bookmarkEnd w:id="61"/>
-    <w:bookmarkStart w:id="118" w:name="sec:results"/>
+    <w:bookmarkEnd w:id="62"/>
+    <w:bookmarkStart w:id="121" w:name="sec:results"/>
     <w:p>
       <w:pPr>
         <w:pStyle w:val="Heading1"/>
@@ -7565,7 +7595,7 @@
         <w:t xml:space="preserve">Results</w:t>
       </w:r>
     </w:p>
-    <w:bookmarkStart w:id="65" w:name="sec:res-retrieval"/>
+    <w:bookmarkStart w:id="66" w:name="sec:res-retrieval"/>
     <w:p>
       <w:pPr>
         <w:pStyle w:val="Heading2"/>
@@ -7647,18 +7677,18 @@
           <wp:inline>
             <wp:extent cx="5334000" cy="1559894"/>
             <wp:effectExtent b="0" l="0" r="0" t="0"/>
-            <wp:docPr descr="" title="" id="63" name="Picture"/>
+            <wp:docPr descr="" title="" id="64" name="Picture"/>
             <a:graphic>
               <a:graphicData uri="http://schemas.openxmlformats.org/drawingml/2006/picture">
                 <pic:pic>
                   <pic:nvPicPr>
-                    <pic:cNvPr descr="/home/claude/rag-embed-transfer/paper_figures/out/fig9_retrieval.png" id="64" name="Picture"/>
+                    <pic:cNvPr descr="/home/claude/rag-embed-transfer/paper_figures/out/fig9_retrieval.png" id="65" name="Picture"/>
                     <pic:cNvPicPr>
                       <a:picLocks noChangeArrowheads="1" noChangeAspect="1"/>
                     </pic:cNvPicPr>
                   </pic:nvPicPr>
                   <pic:blipFill>
-                    <a:blip r:embed="rId62"/>
+                    <a:blip r:embed="rId63"/>
                     <a:stretch>
                       <a:fillRect/>
                     </a:stretch>
@@ -8892,8 +8922,8 @@
         <w:t xml:space="preserve">. Both@5: both gold passages in the top five.</w:t>
       </w:r>
     </w:p>
-    <w:bookmarkEnd w:id="65"/>
-    <w:bookmarkStart w:id="72" w:name="sec:res-transfer"/>
+    <w:bookmarkEnd w:id="66"/>
+    <w:bookmarkStart w:id="73" w:name="sec:res-transfer"/>
     <w:p>
       <w:pPr>
         <w:pStyle w:val="Heading2"/>
@@ -8947,18 +8977,18 @@
           <wp:inline>
             <wp:extent cx="5334000" cy="3547267"/>
             <wp:effectExtent b="0" l="0" r="0" t="0"/>
-            <wp:docPr descr="" title="" id="67" name="Picture"/>
+            <wp:docPr descr="" title="" id="68" name="Picture"/>
             <a:graphic>
               <a:graphicData uri="http://schemas.openxmlformats.org/drawingml/2006/picture">
                 <pic:pic>
                   <pic:nvPicPr>
-                    <pic:cNvPr descr="/home/claude/rag-embed-transfer/paper_figures/out/fig2_hit_vs_em.png" id="68" name="Picture"/>
+                    <pic:cNvPr descr="/home/claude/rag-embed-transfer/paper_figures/out/fig2_hit_vs_em.png" id="69" name="Picture"/>
                     <pic:cNvPicPr>
                       <a:picLocks noChangeArrowheads="1" noChangeAspect="1"/>
                     </pic:cNvPicPr>
                   </pic:nvPicPr>
                   <pic:blipFill>
-                    <a:blip r:embed="rId66"/>
+                    <a:blip r:embed="rId67"/>
                     <a:stretch>
                       <a:fillRect/>
                     </a:stretch>
@@ -9057,18 +9087,18 @@
           <wp:inline>
             <wp:extent cx="5334000" cy="1897522"/>
             <wp:effectExtent b="0" l="0" r="0" t="0"/>
-            <wp:docPr descr="" title="" id="70" name="Picture"/>
+            <wp:docPr descr="" title="" id="71" name="Picture"/>
             <a:graphic>
               <a:graphicData uri="http://schemas.openxmlformats.org/drawingml/2006/picture">
                 <pic:pic>
                   <pic:nvPicPr>
-                    <pic:cNvPr descr="/home/claude/rag-embed-transfer/paper_figures/out/fig1_transfer_ratios.png" id="71" name="Picture"/>
+                    <pic:cNvPr descr="/home/claude/rag-embed-transfer/paper_figures/out/fig1_transfer_ratios.png" id="72" name="Picture"/>
                     <pic:cNvPicPr>
                       <a:picLocks noChangeArrowheads="1" noChangeAspect="1"/>
                     </pic:cNvPicPr>
                   </pic:nvPicPr>
                   <pic:blipFill>
-                    <a:blip r:embed="rId69"/>
+                    <a:blip r:embed="rId70"/>
                     <a:stretch>
                       <a:fillRect/>
                     </a:stretch>
@@ -11024,8 +11054,8 @@
         <w:t xml:space="preserve">points or not significant after Holm). BM25 on NQ retrieves worse than MiniLM-L6, so its ratio describes a loss.</w:t>
       </w:r>
     </w:p>
-    <w:bookmarkEnd w:id="72"/>
-    <w:bookmarkStart w:id="73" w:name="sec:res-sens"/>
+    <w:bookmarkEnd w:id="73"/>
+    <w:bookmarkStart w:id="74" w:name="sec:res-sens"/>
     <w:p>
       <w:pPr>
         <w:pStyle w:val="Heading2"/>
@@ -11985,8 +12015,8 @@
         <w:t xml:space="preserve">passages read (Qwen reader, NQ only; exploratory, without the reporting rule).</w:t>
       </w:r>
     </w:p>
-    <w:bookmarkEnd w:id="73"/>
-    <w:bookmarkStart w:id="77" w:name="sec:res-full"/>
+    <w:bookmarkEnd w:id="74"/>
+    <w:bookmarkStart w:id="78" w:name="sec:res-full"/>
     <w:p>
       <w:pPr>
         <w:pStyle w:val="Heading2"/>
@@ -12107,18 +12137,18 @@
           <wp:inline>
             <wp:extent cx="2959100" cy="1663700"/>
             <wp:effectExtent b="0" l="0" r="0" t="0"/>
-            <wp:docPr descr="" title="" id="75" name="Picture"/>
+            <wp:docPr descr="" title="" id="76" name="Picture"/>
             <a:graphic>
               <a:graphicData uri="http://schemas.openxmlformats.org/drawingml/2006/picture">
                 <pic:pic>
                   <pic:nvPicPr>
-                    <pic:cNvPr descr="figs/fig13_fullcorpus_T.pdf" id="76" name="Picture"/>
+                    <pic:cNvPr descr="figs/fig13_fullcorpus_T.pdf" id="77" name="Picture"/>
                     <pic:cNvPicPr>
                       <a:picLocks noChangeArrowheads="1" noChangeAspect="1"/>
                     </pic:cNvPicPr>
                   </pic:nvPicPr>
                   <pic:blipFill>
-                    <a:blip r:embed="rId74"/>
+                    <a:blip r:embed="rId75"/>
                     <a:stretch>
                       <a:fillRect/>
                     </a:stretch>
@@ -13479,8 +13509,8 @@
         <w:t xml:space="preserve">sub (intervals in the repository), exact McNemar test, Holm over the four retrievers per reader. Full-corpus ratios use the reporting rule with Holm over the six pairs among the four retrievers. BM25’s ratio relates an EM loss to a Hit@5 loss.</w:t>
       </w:r>
     </w:p>
-    <w:bookmarkEnd w:id="77"/>
-    <w:bookmarkStart w:id="87" w:name="sec:res-decomp"/>
+    <w:bookmarkEnd w:id="78"/>
+    <w:bookmarkStart w:id="90" w:name="sec:res-decomp"/>
     <w:p>
       <w:pPr>
         <w:pStyle w:val="Heading2"/>
@@ -13489,7 +13519,7 @@
         <w:t xml:space="preserve">Where the gain sits</w:t>
       </w:r>
     </w:p>
-    <w:bookmarkStart w:id="78" w:name="query-level-accounting-1"/>
+    <w:bookmarkStart w:id="79" w:name="query-level-accounting-1"/>
     <w:p>
       <w:pPr>
         <w:pStyle w:val="Heading4"/>
@@ -13579,8 +13609,8 @@
         <w:t xml:space="preserve">These groups are defined by retrieval outcomes and are not randomised, so they describe where the EM gain sits, not why. The NQ pattern is consistent with sparse relevance labels and with answers the reader already knew, and the HotpotQA pattern with the second supporting passage being the useful one.</w:t>
       </w:r>
     </w:p>
-    <w:bookmarkEnd w:id="78"/>
-    <w:bookmarkStart w:id="81" w:name="answer-strings-in-nq-misses"/>
+    <w:bookmarkEnd w:id="79"/>
+    <w:bookmarkStart w:id="80" w:name="answer-strings-in-nq-misses"/>
     <w:p>
       <w:pPr>
         <w:pStyle w:val="Heading4"/>
@@ -13609,6 +13639,46 @@
       </w:r>
       <w:r>
         <w:t xml:space="preserve">checks the label-sparsity reading for NQ. Among the Hit@5 misses of the dense encoders, 0.41–0.55 had a reference answer string in their top five passages on the sub-corpus (e5-base-v2: 0.50 [0.45, 0.55] of 414 misses) and 0.44–0.58 on the full corpus; for BM25 the share was 0.33. Among hits it was 0.92–0.94. The check is lexical and incomplete in both directions. A passage can mention the answer without supporting it, and the gold passages themselves contained an answer string for only 0.93 [0.92, 0.94] of the queries. Even so, a large part of what Hit@5 counts as a miss gave the reader a passage with the answer in it.</w:t>
+      </w:r>
+    </w:p>
+    <w:bookmarkEnd w:id="80"/>
+    <w:bookmarkStart w:id="84" w:name="human-audit-of-misses"/>
+    <w:p>
+      <w:pPr>
+        <w:pStyle w:val="Heading4"/>
+      </w:pPr>
+      <w:r>
+        <w:t xml:space="preserve">Human audit of misses</w:t>
+      </w:r>
+    </w:p>
+    <w:p>
+      <w:pPr>
+        <w:pStyle w:val="FirstParagraph"/>
+      </w:pPr>
+      <w:r>
+        <w:t xml:space="preserve">The registered audit checks this by hand. From the 414 sub-corpus Hit@5 misses of e5-base-v2, 100 were drawn with a fixed seed, and the author labelled them without seeing the reader’s answer or the automatic flag (Table </w:t>
+      </w:r>
+      <w:hyperlink w:anchor="tab:humanaudit">
+        <w:r>
+          <w:rPr>
+            <w:rStyle w:val="Hyperlink"/>
+          </w:rPr>
+          <w:t xml:space="preserve">3</w:t>
+        </w:r>
+      </w:hyperlink>
+      <w:r>
+        <w:t xml:space="preserve">). A retrieved passage contained a correct answer for 41 of the 100 questions (Wilson 95% interval [0.32, 0.51]), none did for 53, and 6 were unclear. All 41 of these passages were about the question’s subject, so they were relevant passages without a gold label rather than chance mentions. The automatic check had flagged 45 of the same 100 and agreed with the human label on 92 of 94 items labelled yes or no (</w:t>
+      </w:r>
+      <m:oMath>
+        <m:r>
+          <m:t>κ</m:t>
+        </m:r>
+      </m:oMath>
+      <w:r>
+        <w:t xml:space="preserve"> </w:t>
+      </w:r>
+      <w:r>
+        <w:t xml:space="preserve">= 0.96; not pre-specified). On a second screen, the author judged the reader’s answer correct for 59 of the 100 ([0.49, 0.68]), against 24 counted by EM. Of the 35 correct answers with EM 0, 21 differed from a reference only by an alias or formatting, and 14 were correct answers that no reference listed. In this sample, Hit@5 counted relevant evidence as missing, and EM counted correct answers as wrong.</w:t>
       </w:r>
     </w:p>
     <w:tbl>
@@ -14337,7 +14407,7 @@
         <w:t xml:space="preserve">.</w:t>
       </w:r>
     </w:p>
-    <w:bookmarkStart w:id="79" w:name="tab:hpevidence"/>
+    <w:bookmarkStart w:id="81" w:name="tab:hpevidence"/>
     <w:p>
       <w:pPr>
         <w:pStyle w:val="TableCaption"/>
@@ -14586,7 +14656,7 @@
         </w:tc>
       </w:tr>
     </w:tbl>
-    <w:bookmarkEnd w:id="79"/>
+    <w:bookmarkEnd w:id="81"/>
     <w:p>
       <w:pPr>
         <w:pStyle w:val="BodyText"/>
@@ -14618,7 +14688,7 @@
         <w:t xml:space="preserve">EM exactly. Shares above 100% occur because the other two groups contribute small losses.</w:t>
       </w:r>
     </w:p>
-    <w:bookmarkStart w:id="80" w:name="tab:answerstr"/>
+    <w:bookmarkStart w:id="82" w:name="tab:answerstr"/>
     <w:p>
       <w:pPr>
         <w:pStyle w:val="TableCaption"/>
@@ -15305,7 +15375,7 @@
         </w:tc>
       </w:tr>
     </w:tbl>
-    <w:bookmarkEnd w:id="80"/>
+    <w:bookmarkEnd w:id="82"/>
     <w:p>
       <w:pPr>
         <w:pStyle w:val="BodyText"/>
@@ -15318,8 +15388,363 @@
         <w:t xml:space="preserve">Automatic, lexical check: a normalised reference answer occurs as a whole-token span of a normalised passage (title and text), the rule of answer containment. Under this rule the gold passages contain an answer for 0.93 of the queries. A match does not show that the passage supports the answer.</w:t>
       </w:r>
     </w:p>
-    <w:bookmarkEnd w:id="81"/>
-    <w:bookmarkStart w:id="85" w:name="decomposition-1"/>
+    <w:bookmarkStart w:id="83" w:name="tab:humanaudit"/>
+    <w:p>
+      <w:pPr>
+        <w:pStyle w:val="TableCaption"/>
+      </w:pPr>
+      <w:r>
+        <w:t xml:space="preserve">Blinded human audit of 100 seeded Hit@5 misses of e5-base-v2 (NQ sub-corpus, Qwen reader; one annotator, the author).</w:t>
+      </w:r>
+    </w:p>
+    <w:tbl>
+      <w:tblPr>
+        <w:tblStyle w:val="Table"/>
+        <w:tblW w:type="pct" w:w="2100"/>
+        <w:tblLook w:firstRow="1" w:lastRow="0" w:firstColumn="0" w:lastColumn="0" w:noHBand="0" w:noVBand="0" w:val="0020"/>
+        <w:jc w:val="start"/>
+        <w:tblCaption w:val="Blinded human audit of 100 seeded Hit@5 misses of e5-base-v2 (NQ sub-corpus, Qwen reader; one annotator, the author)."/>
+      </w:tblPr>
+      <w:tblGrid>
+        <w:gridCol w:w="3326"/>
+        <w:gridCol w:w="0"/>
+        <w:gridCol w:w="0"/>
+        <w:gridCol w:w="0"/>
+      </w:tblGrid>
+      <w:tr>
+        <w:trPr>
+          <w:tblHeader w:val="true"/>
+        </w:trPr>
+        <w:tc>
+          <w:tcPr/>
+          <w:p>
+            <w:pPr>
+              <w:pStyle w:val="Compact"/>
+              <w:jc w:val="left"/>
+            </w:pPr>
+            <w:r>
+              <w:t xml:space="preserve">Label</w:t>
+            </w:r>
+          </w:p>
+        </w:tc>
+        <w:tc>
+          <w:tcPr/>
+          <w:p>
+            <w:pPr>
+              <w:pStyle w:val="Compact"/>
+              <w:jc w:val="left"/>
+            </w:pPr>
+            <w:r>
+              <w:t xml:space="preserve">Value</w:t>
+            </w:r>
+          </w:p>
+        </w:tc>
+        <w:tc>
+          <w:tcPr/>
+          <w:p>
+            <w:pPr>
+              <w:pStyle w:val="Compact"/>
+              <w:jc w:val="left"/>
+            </w:pPr>
+            <w:r>
+              <w:t xml:space="preserve">Count</w:t>
+            </w:r>
+          </w:p>
+        </w:tc>
+        <w:tc>
+          <w:tcPr/>
+          <w:p>
+            <w:pPr>
+              <w:pStyle w:val="Compact"/>
+              <w:jc w:val="left"/>
+            </w:pPr>
+            <w:r>
+              <w:t xml:space="preserve">95% CI</w:t>
+            </w:r>
+          </w:p>
+        </w:tc>
+      </w:tr>
+      <w:tr>
+        <w:tc>
+          <w:tcPr/>
+          <w:p>
+            <w:pPr>
+              <w:pStyle w:val="Compact"/>
+              <w:jc w:val="left"/>
+            </w:pPr>
+            <w:r>
+              <w:t xml:space="preserve">A: a passage contains a correct answer</w:t>
+            </w:r>
+          </w:p>
+        </w:tc>
+        <w:tc>
+          <w:tcPr/>
+          <w:p>
+            <w:pPr>
+              <w:pStyle w:val="Compact"/>
+              <w:jc w:val="left"/>
+            </w:pPr>
+            <w:r>
+              <w:t xml:space="preserve">yes / no / unsure</w:t>
+            </w:r>
+          </w:p>
+        </w:tc>
+        <w:tc>
+          <w:tcPr/>
+          <w:p>
+            <w:pPr>
+              <w:pStyle w:val="Compact"/>
+              <w:jc w:val="left"/>
+            </w:pPr>
+            <w:r>
+              <w:t xml:space="preserve">41 / 53 / 6</w:t>
+            </w:r>
+          </w:p>
+        </w:tc>
+        <w:tc>
+          <w:tcPr/>
+          <w:p>
+            <w:pPr>
+              <w:pStyle w:val="Compact"/>
+              <w:jc w:val="left"/>
+            </w:pPr>
+            <w:r>
+              <w:t xml:space="preserve">[0.32, 0.51]</w:t>
+            </w:r>
+          </w:p>
+        </w:tc>
+      </w:tr>
+      <w:tr>
+        <w:tc>
+          <w:tcPr/>
+          <w:p>
+            <w:pPr>
+              <w:pStyle w:val="Compact"/>
+              <w:jc w:val="left"/>
+            </w:pPr>
+            <w:r>
+              <w:t xml:space="preserve">B: that passage is about the question (of A = yes)</w:t>
+            </w:r>
+          </w:p>
+        </w:tc>
+        <w:tc>
+          <w:tcPr/>
+          <w:p>
+            <w:pPr>
+              <w:pStyle w:val="Compact"/>
+              <w:jc w:val="left"/>
+            </w:pPr>
+            <w:r>
+              <w:t xml:space="preserve">yes</w:t>
+            </w:r>
+          </w:p>
+        </w:tc>
+        <w:tc>
+          <w:tcPr/>
+          <w:p>
+            <w:pPr>
+              <w:pStyle w:val="Compact"/>
+              <w:jc w:val="left"/>
+            </w:pPr>
+            <w:r>
+              <w:t xml:space="preserve">41 of 41</w:t>
+            </w:r>
+          </w:p>
+        </w:tc>
+        <w:tc>
+          <w:tcPr/>
+          <w:p>
+            <w:pPr>
+              <w:pStyle w:val="Compact"/>
+              <w:jc w:val="left"/>
+            </w:pPr>
+            <w:r>
+              <w:t xml:space="preserve">[0.91, 1.00]</w:t>
+            </w:r>
+          </w:p>
+        </w:tc>
+      </w:tr>
+      <w:tr>
+        <w:tc>
+          <w:tcPr/>
+          <w:p>
+            <w:pPr>
+              <w:pStyle w:val="Compact"/>
+              <w:jc w:val="left"/>
+            </w:pPr>
+            <w:r>
+              <w:t xml:space="preserve">C: reader answer factually correct</w:t>
+            </w:r>
+          </w:p>
+        </w:tc>
+        <w:tc>
+          <w:tcPr/>
+          <w:p>
+            <w:pPr>
+              <w:pStyle w:val="Compact"/>
+              <w:jc w:val="left"/>
+            </w:pPr>
+            <w:r>
+              <w:t xml:space="preserve">yes / no / unsure</w:t>
+            </w:r>
+          </w:p>
+        </w:tc>
+        <w:tc>
+          <w:tcPr/>
+          <w:p>
+            <w:pPr>
+              <w:pStyle w:val="Compact"/>
+              <w:jc w:val="left"/>
+            </w:pPr>
+            <w:r>
+              <w:t xml:space="preserve">59 / 31 / 10</w:t>
+            </w:r>
+          </w:p>
+        </w:tc>
+        <w:tc>
+          <w:tcPr/>
+          <w:p>
+            <w:pPr>
+              <w:pStyle w:val="Compact"/>
+              <w:jc w:val="left"/>
+            </w:pPr>
+            <w:r>
+              <w:t xml:space="preserve">[0.49, 0.68]</w:t>
+            </w:r>
+          </w:p>
+        </w:tc>
+      </w:tr>
+      <w:tr>
+        <w:tc>
+          <w:tcPr/>
+          <w:p>
+            <w:pPr>
+              <w:pStyle w:val="Compact"/>
+              <w:jc w:val="left"/>
+            </w:pPr>
+            <w:r>
+              <w:t xml:space="preserve">EM = 1 (automatic)</w:t>
+            </w:r>
+          </w:p>
+        </w:tc>
+        <w:tc>
+          <w:tcPr/>
+          <w:p>
+            <w:pPr>
+              <w:pStyle w:val="Compact"/>
+            </w:pPr>
+          </w:p>
+        </w:tc>
+        <w:tc>
+          <w:tcPr/>
+          <w:p>
+            <w:pPr>
+              <w:pStyle w:val="Compact"/>
+              <w:jc w:val="left"/>
+            </w:pPr>
+            <w:r>
+              <w:t xml:space="preserve">24</w:t>
+            </w:r>
+          </w:p>
+        </w:tc>
+        <w:tc>
+          <w:tcPr/>
+          <w:p>
+            <w:pPr>
+              <w:pStyle w:val="Compact"/>
+              <w:jc w:val="left"/>
+            </w:pPr>
+            <w:r>
+              <w:t xml:space="preserve">[0.17, 0.33]</w:t>
+            </w:r>
+          </w:p>
+        </w:tc>
+      </w:tr>
+      <w:tr>
+        <w:tc>
+          <w:tcPr/>
+          <w:p>
+            <w:pPr>
+              <w:pStyle w:val="Compact"/>
+              <w:jc w:val="left"/>
+            </w:pPr>
+            <w:r>
+              <w:t xml:space="preserve">D: alias or formatting only (of C = yes, EM = 0)</w:t>
+            </w:r>
+          </w:p>
+        </w:tc>
+        <w:tc>
+          <w:tcPr/>
+          <w:p>
+            <w:pPr>
+              <w:pStyle w:val="Compact"/>
+              <w:jc w:val="left"/>
+            </w:pPr>
+            <w:r>
+              <w:t xml:space="preserve">yes</w:t>
+            </w:r>
+          </w:p>
+        </w:tc>
+        <w:tc>
+          <w:tcPr/>
+          <w:p>
+            <w:pPr>
+              <w:pStyle w:val="Compact"/>
+              <w:jc w:val="left"/>
+            </w:pPr>
+            <w:r>
+              <w:t xml:space="preserve">21 of 35</w:t>
+            </w:r>
+          </w:p>
+        </w:tc>
+        <w:tc>
+          <w:tcPr/>
+          <w:p>
+            <w:pPr>
+              <w:pStyle w:val="Compact"/>
+              <w:jc w:val="left"/>
+            </w:pPr>
+            <w:r>
+              <w:t xml:space="preserve">[0.44, 0.74]</w:t>
+            </w:r>
+          </w:p>
+        </w:tc>
+      </w:tr>
+    </w:tbl>
+    <w:bookmarkEnd w:id="83"/>
+    <w:p>
+      <w:pPr>
+        <w:pStyle w:val="BodyText"/>
+      </w:pPr>
+      <w:r>
+        <w:rPr>
+          <w:iCs/>
+          <w:i/>
+        </w:rPr>
+        <w:t xml:space="preserve">Wilson intervals for the first value of each row. Screen 2 (C, D) was opened only after all Screen 1 labels (A, B) were complete. Not pre-specified: the automatic answer-string flag agreed with A on 92 of 94 yes/no items (</w:t>
+      </w:r>
+      <m:oMath>
+        <m:r>
+          <m:t>κ</m:t>
+        </m:r>
+      </m:oMath>
+      <w:r>
+        <w:rPr>
+          <w:iCs/>
+          <w:i/>
+        </w:rPr>
+        <w:t xml:space="preserve"> </w:t>
+      </w:r>
+      <w:r>
+        <w:rPr>
+          <w:iCs/>
+          <w:i/>
+        </w:rPr>
+        <w:t xml:space="preserve">= 0.96).</w:t>
+      </w:r>
+    </w:p>
+    <w:bookmarkEnd w:id="84"/>
+    <w:bookmarkStart w:id="88" w:name="decomposition-1"/>
     <w:p>
       <w:pPr>
         <w:pStyle w:val="Heading4"/>
@@ -15393,7 +15818,7 @@
           <w:rPr>
             <w:rStyle w:val="Hyperlink"/>
           </w:rPr>
-          <w:t xml:space="preserve">11</w:t>
+          <w:t xml:space="preserve">12</w:t>
         </w:r>
       </w:hyperlink>
       <w:r>
@@ -15431,18 +15856,18 @@
           <wp:inline>
             <wp:extent cx="5334000" cy="2453688"/>
             <wp:effectExtent b="0" l="0" r="0" t="0"/>
-            <wp:docPr descr="" title="" id="83" name="Picture"/>
+            <wp:docPr descr="" title="" id="86" name="Picture"/>
             <a:graphic>
               <a:graphicData uri="http://schemas.openxmlformats.org/drawingml/2006/picture">
                 <pic:pic>
                   <pic:nvPicPr>
-                    <pic:cNvPr descr="/home/claude/rag-embed-transfer/paper_figures/out/fig10_error.png" id="84" name="Picture"/>
+                    <pic:cNvPr descr="/home/claude/rag-embed-transfer/paper_figures/out/fig10_error.png" id="87" name="Picture"/>
                     <pic:cNvPicPr>
                       <a:picLocks noChangeArrowheads="1" noChangeAspect="1"/>
                     </pic:cNvPicPr>
                   </pic:nvPicPr>
                   <pic:blipFill>
-                    <a:blip r:embed="rId82"/>
+                    <a:blip r:embed="rId85"/>
                     <a:stretch>
                       <a:fillRect/>
                     </a:stretch>
@@ -15495,8 +15920,8 @@
         <w:t xml:space="preserve">answers on hits and misses under the abstention prompt A3 (Phase 1, Qwen reader, NQ, 200 queries).</w:t>
       </w:r>
     </w:p>
-    <w:bookmarkEnd w:id="85"/>
-    <w:bookmarkStart w:id="86" w:name="abstention-prompt"/>
+    <w:bookmarkEnd w:id="88"/>
+    <w:bookmarkStart w:id="89" w:name="abstention-prompt"/>
     <w:p>
       <w:pPr>
         <w:pStyle w:val="Heading4"/>
@@ -15517,7 +15942,7 @@
           <w:rPr>
             <w:rStyle w:val="Hyperlink"/>
           </w:rPr>
-          <w:t xml:space="preserve">12</w:t>
+          <w:t xml:space="preserve">13</w:t>
         </w:r>
       </w:hyperlink>
       <w:r>
@@ -15591,9 +16016,9 @@
         <w:t xml:space="preserve">0.07).</w:t>
       </w:r>
     </w:p>
-    <w:bookmarkEnd w:id="86"/>
-    <w:bookmarkEnd w:id="87"/>
-    <w:bookmarkStart w:id="88" w:name="sec:res-encoders"/>
+    <w:bookmarkEnd w:id="89"/>
+    <w:bookmarkEnd w:id="90"/>
+    <w:bookmarkStart w:id="91" w:name="sec:res-encoders"/>
     <w:p>
       <w:pPr>
         <w:pStyle w:val="Heading2"/>
@@ -16403,8 +16828,8 @@
         <w:t xml:space="preserve">= 0.55. Exchangeable working correlation (0.60) within query; 59,570 answers in 4,255 query clusters; empirical (sandwich) standard errors. All models converged without warnings.</w:t>
       </w:r>
     </w:p>
-    <w:bookmarkEnd w:id="88"/>
-    <w:bookmarkStart w:id="101" w:name="sec:res-context"/>
+    <w:bookmarkEnd w:id="91"/>
+    <w:bookmarkStart w:id="104" w:name="sec:res-context"/>
     <w:p>
       <w:pPr>
         <w:pStyle w:val="Heading2"/>
@@ -16413,7 +16838,7 @@
         <w:t xml:space="preserve">Context choices (RQ3)</w:t>
       </w:r>
     </w:p>
-    <w:bookmarkStart w:id="92" w:name="number-of-passages"/>
+    <w:bookmarkStart w:id="95" w:name="number-of-passages"/>
     <w:p>
       <w:pPr>
         <w:pStyle w:val="Heading4"/>
@@ -16434,7 +16859,7 @@
           <w:rPr>
             <w:rStyle w:val="Hyperlink"/>
           </w:rPr>
-          <w:t xml:space="preserve">3</w:t>
+          <w:t xml:space="preserve">4</w:t>
         </w:r>
       </w:hyperlink>
       <w:r>
@@ -16833,18 +17258,18 @@
           <wp:inline>
             <wp:extent cx="3770753" cy="2186608"/>
             <wp:effectExtent b="0" l="0" r="0" t="0"/>
-            <wp:docPr descr="" title="" id="90" name="Picture"/>
+            <wp:docPr descr="" title="" id="93" name="Picture"/>
             <a:graphic>
               <a:graphicData uri="http://schemas.openxmlformats.org/drawingml/2006/picture">
                 <pic:pic>
                   <pic:nvPicPr>
-                    <pic:cNvPr descr="/home/claude/rag-embed-transfer/paper_figures/out/fig3_topk.png" id="91" name="Picture"/>
+                    <pic:cNvPr descr="/home/claude/rag-embed-transfer/paper_figures/out/fig3_topk.png" id="94" name="Picture"/>
                     <pic:cNvPicPr>
                       <a:picLocks noChangeArrowheads="1" noChangeAspect="1"/>
                     </pic:cNvPicPr>
                   </pic:nvPicPr>
                   <pic:blipFill>
-                    <a:blip r:embed="rId89"/>
+                    <a:blip r:embed="rId92"/>
                     <a:stretch>
                       <a:fillRect/>
                     </a:stretch>
@@ -16890,8 +17315,8 @@
         <w:t xml:space="preserve">, Qwen reader on NQ (2,255 queries).</w:t>
       </w:r>
     </w:p>
-    <w:bookmarkEnd w:id="92"/>
-    <w:bookmarkStart w:id="98" w:name="passage-composition-and-position"/>
+    <w:bookmarkEnd w:id="95"/>
+    <w:bookmarkStart w:id="101" w:name="passage-composition-and-position"/>
     <w:p>
       <w:pPr>
         <w:pStyle w:val="Heading4"/>
@@ -16912,7 +17337,7 @@
           <w:rPr>
             <w:rStyle w:val="Hyperlink"/>
           </w:rPr>
-          <w:t xml:space="preserve">4</w:t>
+          <w:t xml:space="preserve">5</w:t>
         </w:r>
       </w:hyperlink>
       <w:r>
@@ -17050,18 +17475,18 @@
           <wp:inline>
             <wp:extent cx="3990943" cy="1617784"/>
             <wp:effectExtent b="0" l="0" r="0" t="0"/>
-            <wp:docPr descr="" title="" id="94" name="Picture"/>
+            <wp:docPr descr="" title="" id="97" name="Picture"/>
             <a:graphic>
               <a:graphicData uri="http://schemas.openxmlformats.org/drawingml/2006/picture">
                 <pic:pic>
                   <pic:nvPicPr>
-                    <pic:cNvPr descr="/home/claude/rag-embed-transfer/paper_figures/out/fig4_mechanism.png" id="95" name="Picture"/>
+                    <pic:cNvPr descr="/home/claude/rag-embed-transfer/paper_figures/out/fig4_mechanism.png" id="98" name="Picture"/>
                     <pic:cNvPicPr>
                       <a:picLocks noChangeArrowheads="1" noChangeAspect="1"/>
                     </pic:cNvPicPr>
                   </pic:nvPicPr>
                   <pic:blipFill>
-                    <a:blip r:embed="rId93"/>
+                    <a:blip r:embed="rId96"/>
                     <a:stretch>
                       <a:fillRect/>
                     </a:stretch>
@@ -17096,7 +17521,7 @@
         <w:t xml:space="preserve">Exact match for five controlled contexts of five passages (Qwen reader, 500 NQ generation queries) with 95% bootstrap intervals.</w:t>
       </w:r>
     </w:p>
-    <w:bookmarkStart w:id="96" w:name="tab:topk"/>
+    <w:bookmarkStart w:id="99" w:name="tab:topk"/>
     <w:p>
       <w:pPr>
         <w:pStyle w:val="TableCaption"/>
@@ -18019,7 +18444,7 @@
         </w:tc>
       </w:tr>
     </w:tbl>
-    <w:bookmarkEnd w:id="96"/>
+    <w:bookmarkEnd w:id="99"/>
     <w:p>
       <w:pPr>
         <w:pStyle w:val="BodyText"/>
@@ -18095,7 +18520,7 @@
         <w:t xml:space="preserve">, Holm over seven retrievers.</w:t>
       </w:r>
     </w:p>
-    <w:bookmarkStart w:id="97" w:name="tab:mechanism"/>
+    <w:bookmarkStart w:id="100" w:name="tab:mechanism"/>
     <w:p>
       <w:pPr>
         <w:pStyle w:val="TableCaption"/>
@@ -18422,7 +18847,7 @@
         </w:tc>
       </w:tr>
     </w:tbl>
-    <w:bookmarkEnd w:id="97"/>
+    <w:bookmarkEnd w:id="100"/>
     <w:p>
       <w:pPr>
         <w:pStyle w:val="BodyText"/>
@@ -18548,8 +18973,8 @@
         <w:t xml:space="preserve">. Position: no pair differs after Holm.</w:t>
       </w:r>
     </w:p>
-    <w:bookmarkEnd w:id="98"/>
-    <w:bookmarkStart w:id="100" w:name="reranking"/>
+    <w:bookmarkEnd w:id="101"/>
+    <w:bookmarkStart w:id="103" w:name="reranking"/>
     <w:p>
       <w:pPr>
         <w:pStyle w:val="Heading4"/>
@@ -18570,7 +18995,7 @@
           <w:rPr>
             <w:rStyle w:val="Hyperlink"/>
           </w:rPr>
-          <w:t xml:space="preserve">5</w:t>
+          <w:t xml:space="preserve">6</w:t>
         </w:r>
       </w:hyperlink>
       <w:r>
@@ -18654,7 +19079,7 @@
         <w:t xml:space="preserve">= 0.069), and no difference was detected. Reranking cost a median of 208 to 249 ms per query on a T4. These results come from one reranker at one depth.</w:t>
       </w:r>
     </w:p>
-    <w:bookmarkStart w:id="99" w:name="tab:reranker"/>
+    <w:bookmarkStart w:id="102" w:name="tab:reranker"/>
     <w:p>
       <w:pPr>
         <w:pStyle w:val="TableCaption"/>
@@ -18992,7 +19417,7 @@
         </w:tc>
       </w:tr>
     </w:tbl>
-    <w:bookmarkEnd w:id="99"/>
+    <w:bookmarkEnd w:id="102"/>
     <w:p>
       <w:pPr>
         <w:pStyle w:val="BodyText"/>
@@ -19005,9 +19430,9 @@
         <w:t xml:space="preserve">Retrieval on all 3,452 judged queries; EM on the 2,255 generation queries (Qwen). Latency: median per query, 50 pairs, one T4.</w:t>
       </w:r>
     </w:p>
-    <w:bookmarkEnd w:id="100"/>
-    <w:bookmarkEnd w:id="101"/>
-    <w:bookmarkStart w:id="114" w:name="sec:res-cost"/>
+    <w:bookmarkEnd w:id="103"/>
+    <w:bookmarkEnd w:id="104"/>
+    <w:bookmarkStart w:id="117" w:name="sec:res-cost"/>
     <w:p>
       <w:pPr>
         <w:pStyle w:val="Heading2"/>
@@ -19016,7 +19441,7 @@
         <w:t xml:space="preserve">Retrieval-stage cost and checks of the setup (RQ4)</w:t>
       </w:r>
     </w:p>
-    <w:bookmarkStart w:id="106" w:name="encoding-cost"/>
+    <w:bookmarkStart w:id="109" w:name="encoding-cost"/>
     <w:p>
       <w:pPr>
         <w:pStyle w:val="Heading4"/>
@@ -19037,7 +19462,7 @@
           <w:rPr>
             <w:rStyle w:val="Hyperlink"/>
           </w:rPr>
-          <w:t xml:space="preserve">6</w:t>
+          <w:t xml:space="preserve">7</w:t>
         </w:r>
       </w:hyperlink>
       <w:r>
@@ -19051,7 +19476,7 @@
           <w:rPr>
             <w:rStyle w:val="Hyperlink"/>
           </w:rPr>
-          <w:t xml:space="preserve">6</w:t>
+          <w:t xml:space="preserve">7</w:t>
         </w:r>
       </w:hyperlink>
       <w:r>
@@ -19081,18 +19506,18 @@
           <wp:inline>
             <wp:extent cx="2972564" cy="2256947"/>
             <wp:effectExtent b="0" l="0" r="0" t="0"/>
-            <wp:docPr descr="" title="" id="103" name="Picture"/>
+            <wp:docPr descr="" title="" id="106" name="Picture"/>
             <a:graphic>
               <a:graphicData uri="http://schemas.openxmlformats.org/drawingml/2006/picture">
                 <pic:pic>
                   <pic:nvPicPr>
-                    <pic:cNvPr descr="/home/claude/rag-embed-transfer/paper_figures/out/fig5_cost_quality.png" id="104" name="Picture"/>
+                    <pic:cNvPr descr="/home/claude/rag-embed-transfer/paper_figures/out/fig5_cost_quality.png" id="107" name="Picture"/>
                     <pic:cNvPicPr>
                       <a:picLocks noChangeArrowheads="1" noChangeAspect="1"/>
                     </pic:cNvPicPr>
                   </pic:nvPicPr>
                   <pic:blipFill>
-                    <a:blip r:embed="rId102"/>
+                    <a:blip r:embed="rId105"/>
                     <a:stretch>
                       <a:fillRect/>
                     </a:stretch>
@@ -19127,7 +19552,7 @@
         <w:t xml:space="preserve">Encoding throughput on one T4 GPU (median of five repetitions, log scale) against EM averaged over the four reader–dataset cells. The dashed line joins encoders that no other encoder beats on both axes.</w:t>
       </w:r>
     </w:p>
-    <w:bookmarkStart w:id="105" w:name="tab:cost"/>
+    <w:bookmarkStart w:id="108" w:name="tab:cost"/>
     <w:p>
       <w:pPr>
         <w:pStyle w:val="TableCaption"/>
@@ -19589,7 +20014,7 @@
         </w:tc>
       </w:tr>
     </w:tbl>
-    <w:bookmarkEnd w:id="105"/>
+    <w:bookmarkEnd w:id="108"/>
     <w:p>
       <w:pPr>
         <w:pStyle w:val="BodyText"/>
@@ -19602,8 +20027,8 @@
         <w:t xml:space="preserve">BM25 batch-1 query latency on CPU: 25.7 ms (23.7–27.7).</w:t>
       </w:r>
     </w:p>
-    <w:bookmarkEnd w:id="106"/>
-    <w:bookmarkStart w:id="107" w:name="cpu-deployment"/>
+    <w:bookmarkEnd w:id="109"/>
+    <w:bookmarkStart w:id="110" w:name="cpu-deployment"/>
     <w:p>
       <w:pPr>
         <w:pStyle w:val="Heading4"/>
@@ -19631,8 +20056,8 @@
         <w:t xml:space="preserve">.</w:t>
       </w:r>
     </w:p>
-    <w:bookmarkEnd w:id="107"/>
-    <w:bookmarkStart w:id="108" w:name="approximate-search"/>
+    <w:bookmarkEnd w:id="110"/>
+    <w:bookmarkStart w:id="111" w:name="approximate-search"/>
     <w:p>
       <w:pPr>
         <w:pStyle w:val="Heading4"/>
@@ -20302,8 +20727,8 @@
         <w:t xml:space="preserve">Ov@5 / Ov@100: mean share of the exact top 5 / top 100 that HNSW also returns. Hit@5 here is over all judged queries, not the 2,255 generation queries. ms: median batch-1 query latency on 4 vCPUs. No reader was run on HNSW results.</w:t>
       </w:r>
     </w:p>
-    <w:bookmarkEnd w:id="108"/>
-    <w:bookmarkStart w:id="113" w:name="sub-corpus-versus-full-corpus"/>
+    <w:bookmarkEnd w:id="111"/>
+    <w:bookmarkStart w:id="116" w:name="sub-corpus-versus-full-corpus"/>
     <w:p>
       <w:pPr>
         <w:pStyle w:val="Heading4"/>
@@ -20338,7 +20763,7 @@
           <w:rPr>
             <w:rStyle w:val="Hyperlink"/>
           </w:rPr>
-          <w:t xml:space="preserve">7</w:t>
+          <w:t xml:space="preserve">8</w:t>
         </w:r>
       </w:hyperlink>
       <w:r>
@@ -20382,18 +20807,18 @@
           <wp:inline>
             <wp:extent cx="2975622" cy="1544387"/>
             <wp:effectExtent b="0" l="0" r="0" t="0"/>
-            <wp:docPr descr="" title="" id="110" name="Picture"/>
+            <wp:docPr descr="" title="" id="113" name="Picture"/>
             <a:graphic>
               <a:graphicData uri="http://schemas.openxmlformats.org/drawingml/2006/picture">
                 <pic:pic>
                   <pic:nvPicPr>
-                    <pic:cNvPr descr="/home/claude/rag-embed-transfer/paper_figures/out/fig6_full_corpus.png" id="111" name="Picture"/>
+                    <pic:cNvPr descr="/home/claude/rag-embed-transfer/paper_figures/out/fig6_full_corpus.png" id="114" name="Picture"/>
                     <pic:cNvPicPr>
                       <a:picLocks noChangeArrowheads="1" noChangeAspect="1"/>
                     </pic:cNvPicPr>
                   </pic:nvPicPr>
                   <pic:blipFill>
-                    <a:blip r:embed="rId109"/>
+                    <a:blip r:embed="rId112"/>
                     <a:stretch>
                       <a:fillRect/>
                     </a:stretch>
@@ -20428,7 +20853,7 @@
         <w:t xml:space="preserve">nDCG@10 on the 300,000-passage sub-corpus and on the full NQ corpus (all 3,452 judged queries).</w:t>
       </w:r>
     </w:p>
-    <w:bookmarkStart w:id="112" w:name="tab:fullcorpus"/>
+    <w:bookmarkStart w:id="115" w:name="tab:fullcorpus"/>
     <w:p>
       <w:pPr>
         <w:pStyle w:val="TableCaption"/>
@@ -20766,7 +21191,7 @@
         </w:tc>
       </w:tr>
     </w:tbl>
-    <w:bookmarkEnd w:id="112"/>
+    <w:bookmarkEnd w:id="115"/>
     <w:p>
       <w:pPr>
         <w:pStyle w:val="BodyText"/>
@@ -20805,9 +21230,9 @@
         <w:t xml:space="preserve">between the two orderings = 1.00.</w:t>
       </w:r>
     </w:p>
-    <w:bookmarkEnd w:id="113"/>
-    <w:bookmarkEnd w:id="114"/>
-    <w:bookmarkStart w:id="116" w:name="sec:res-judge"/>
+    <w:bookmarkEnd w:id="116"/>
+    <w:bookmarkEnd w:id="117"/>
+    <w:bookmarkStart w:id="119" w:name="sec:res-judge"/>
     <w:p>
       <w:pPr>
         <w:pStyle w:val="Heading2"/>
@@ -20828,7 +21253,7 @@
           <w:rPr>
             <w:rStyle w:val="Hyperlink"/>
           </w:rPr>
-          <w:t xml:space="preserve">8</w:t>
+          <w:t xml:space="preserve">9</w:t>
         </w:r>
       </w:hyperlink>
       <w:r>
@@ -20870,7 +21295,7 @@
           <w:rPr>
             <w:rStyle w:val="Hyperlink"/>
           </w:rPr>
-          <w:t xml:space="preserve">13</w:t>
+          <w:t xml:space="preserve">14</w:t>
         </w:r>
       </w:hyperlink>
       <w:r>
@@ -20894,7 +21319,7 @@
         <w:t xml:space="preserve">gives the judge prompt and the annotation instructions.</w:t>
       </w:r>
     </w:p>
-    <w:bookmarkStart w:id="115" w:name="tab:judge"/>
+    <w:bookmarkStart w:id="118" w:name="tab:judge"/>
     <w:p>
       <w:pPr>
         <w:pStyle w:val="TableCaption"/>
@@ -21030,7 +21455,7 @@
         </w:tc>
       </w:tr>
     </w:tbl>
-    <w:bookmarkEnd w:id="115"/>
+    <w:bookmarkEnd w:id="118"/>
     <w:p>
       <w:pPr>
         <w:pStyle w:val="BodyText"/>
@@ -21105,8 +21530,8 @@
         <w:t xml:space="preserve">) the judge results are excluded from the conclusions.</w:t>
       </w:r>
     </w:p>
-    <w:bookmarkEnd w:id="116"/>
-    <w:bookmarkStart w:id="117" w:name="summary-of-the-predictions"/>
+    <w:bookmarkEnd w:id="119"/>
+    <w:bookmarkStart w:id="120" w:name="summary-of-the-predictions"/>
     <w:p>
       <w:pPr>
         <w:pStyle w:val="Heading2"/>
@@ -23046,9 +23471,9 @@
         <w:t xml:space="preserve">Confirmatory for bge-small, bge-base, e5-base-v2 and Qwen3-Emb-0.6B only. The v0.3 analysis code also counted BM25 in the NQ P1 checks (six ratios); the registered criterion covers dense encoders, and the verdict is the same either way.</w:t>
       </w:r>
     </w:p>
-    <w:bookmarkEnd w:id="117"/>
-    <w:bookmarkEnd w:id="118"/>
-    <w:bookmarkStart w:id="123" w:name="sec:discussion"/>
+    <w:bookmarkEnd w:id="120"/>
+    <w:bookmarkEnd w:id="121"/>
+    <w:bookmarkStart w:id="126" w:name="sec:discussion"/>
     <w:p>
       <w:pPr>
         <w:pStyle w:val="Heading1"/>
@@ -23057,7 +23482,7 @@
         <w:t xml:space="preserve">Discussion</w:t>
       </w:r>
     </w:p>
-    <w:bookmarkStart w:id="119" w:name="what-the-transfer-ratio-shows"/>
+    <w:bookmarkStart w:id="122" w:name="what-the-transfer-ratio-shows"/>
     <w:p>
       <w:pPr>
         <w:pStyle w:val="Heading2"/>
@@ -23091,7 +23516,7 @@
         </m:r>
       </m:oMath>
       <w:r>
-        <w:t xml:space="preserve">. The registered full-corpus run agreed for the encoders it covered: the ratio of e5-base-v2 moved by −0.02 and +0.04, and both values lay inside the sub-corpus intervals. The query-level accounting shows where the difference between the two gains sits. Queries that newly retrieved a gold passage did gain EM, but 0.23–0.30 of them had already been answered correctly under MiniLM-L6, and queries that kept or lost their hit gave back part of the gain. Three observations within our setup are consistent with this. (i) The readers fell well short of the gold-passage reference even with good retrieval, so part of the loss lies in reading, not retrieval. (ii) EM given a miss stayed far above closed-book EM, and the abstention prompt showed that the reader still answered most misses. The NQ relevance labels are sparse: 0.41–0.55 of dense-encoder misses had an answer string in their top five passages, and the readers may also have known some answers. Hit@5 therefore overstates the difference between encoders that matters for the reader. The full corpus showed the same effect from the other side: it removed about a tenth of the hits of each dense encoder but only 0.20–0.28 EM points per lost hit. (iii) Queries that hit under both retrievers lost a little EM with the stronger encoder, so a change of context can cost answers even when a gold passage stays in the top five. We did not inspect these contexts; this point is a hypothesis.</w:t>
+        <w:t xml:space="preserve">. The registered full-corpus run agreed for the encoders it covered: the ratio of e5-base-v2 moved by −0.02 and +0.04, and both values lay inside the sub-corpus intervals. The query-level accounting shows where the difference between the two gains sits. Queries that newly retrieved a gold passage did gain EM, but 0.23–0.30 of them had already been answered correctly under MiniLM-L6, and queries that kept or lost their hit gave back part of the gain. Three observations within our setup are consistent with this. (i) The readers fell well short of the gold-passage reference even with good retrieval, so part of the loss lies in reading, not retrieval. (ii) EM given a miss stayed far above closed-book EM, and the abstention prompt showed that the reader still answered most misses. The NQ relevance labels are sparse: 0.41–0.55 of dense-encoder misses had an answer string in their top five passages, and in the blinded audit 41 of 100 e5-base-v2 misses had a relevant passage with a correct answer. The readers may also have known some answers. Hit@5 therefore overstates the difference between encoders that matters for the reader. The full corpus showed the same effect from the other side: it removed about a tenth of the hits of each dense encoder but only 0.20–0.28 EM points per lost hit. (iii) Queries that hit under both retrievers lost a little EM with the stronger encoder, so a change of context can cost answers even when a gold passage stays in the top five. We did not inspect these contexts; this point is a hypothesis.</w:t>
       </w:r>
     </w:p>
     <w:p>
@@ -23110,8 +23535,8 @@
         <w:t xml:space="preserve">Measured with Hit@5, the two datasets would support different conclusions about the same encoders. Measured with metrics that count the evidence the question needs, both show an answer gain that is a fraction of the retrieval gain.</w:t>
       </w:r>
     </w:p>
-    <w:bookmarkEnd w:id="119"/>
-    <w:bookmarkStart w:id="120" w:name="comparison-with-earlier-work"/>
+    <w:bookmarkEnd w:id="122"/>
+    <w:bookmarkStart w:id="123" w:name="comparison-with-earlier-work"/>
     <w:p>
       <w:pPr>
         <w:pStyle w:val="Heading2"/>
@@ -23386,8 +23811,8 @@
         <w:t xml:space="preserve">, who also measured answers; we measured retrieval only.</w:t>
       </w:r>
     </w:p>
-    <w:bookmarkEnd w:id="120"/>
-    <w:bookmarkStart w:id="121" w:name="practical-implications"/>
+    <w:bookmarkEnd w:id="123"/>
+    <w:bookmarkStart w:id="124" w:name="practical-implications"/>
     <w:p>
       <w:pPr>
         <w:pStyle w:val="Heading2"/>
@@ -23404,8 +23829,8 @@
         <w:t xml:space="preserve">Within our setup, the choice of encoder mattered less for answers than for retrieval, while its retrieval-stage cost differed by more than an order of magnitude. For single-hop questions, no larger encoder gave a detectably higher EM than a base-size encoder such as e5-base-v2 or bge-base, which encoded 2.9 times faster than bge-large. For multi-hop questions, bge-large gave a small but detectable gain. Qwen3-Embedding-0.6B had the highest retrieval-stage cost and gave lower EM than e5-base-v2 on HotpotQA; its instruction and length settings may not suit this task, and we did not tune them. Retrieving ten passages instead of five raised EM for most retrievers and narrowed their differences, which is another option when the reader’s context allows it, although it nearly doubles the prompt the reader must process. The cross-encoder raised the Hit@5 and EM of the weak BM25 retrieval stage; for e5-base-v2 it lowered Hit@5, and no EM difference was detected. Approximate search returned nearly the same top passages as exact search at a small fraction of the latency; we did not measure its effect on answers.</w:t>
       </w:r>
     </w:p>
-    <w:bookmarkEnd w:id="121"/>
-    <w:bookmarkStart w:id="122" w:name="alternative-explanations"/>
+    <w:bookmarkEnd w:id="124"/>
+    <w:bookmarkStart w:id="125" w:name="alternative-explanations"/>
     <w:p>
       <w:pPr>
         <w:pStyle w:val="Heading2"/>
@@ -23439,7 +23864,7 @@
         <w:t xml:space="preserve">)</w:t>
       </w:r>
       <w:r>
-        <w:t xml:space="preserve">; the F1 and containment ratios were higher but still well below 1. The sub-corpus inflates dense retrieval scores, but on the full corpus the order of four retrievers was kept, the e5-base-v2 ratios stayed inside their sub-corpus intervals for both readers, and the ratios of bge-small and e5-base-v2 against BM25 rose only from 0.29–0.34 to 0.33–0.38. This check covers three dense encoders on NQ; the larger encoders and HotpotQA were not run on a full corpus. Answer-bearing hard negatives did not explain the context effect either: P5 held, with a larger drop, on the questions whose hard negatives contained no answer string. The readers were 4-bit quantised 7–8B models with one prompt; stronger readers may convert hits into answers at a different rate. The ratio also depends on the baseline and on</w:t>
+        <w:t xml:space="preserve">: among the 100 audited misses, the author judged 59 answers correct where EM counted 24. The F1 and containment ratios were higher but still well below 1. The sub-corpus inflates dense retrieval scores, but on the full corpus the order of four retrievers was kept, the e5-base-v2 ratios stayed inside their sub-corpus intervals for both readers, and the ratios of bge-small and e5-base-v2 against BM25 rose only from 0.29–0.34 to 0.33–0.38. This check covers three dense encoders on NQ; the larger encoders and HotpotQA were not run on a full corpus. Answer-bearing hard negatives did not explain the context effect either: P5 held, with a larger drop, on the questions whose hard negatives contained no answer string. The readers were 4-bit quantised 7–8B models with one prompt; stronger readers may convert hits into answers at a different rate. The ratio also depends on the baseline and on</w:t>
       </w:r>
       <w:r>
         <w:t xml:space="preserve"> </w:t>
@@ -23453,9 +23878,9 @@
         <w:t xml:space="preserve">. Against BM25 the NQ ratios were higher (0.29–0.35), and with one passage read they were higher still. The ratio therefore describes a pair of retrievers at a given reading depth, not a single encoder.</w:t>
       </w:r>
     </w:p>
-    <w:bookmarkEnd w:id="122"/>
-    <w:bookmarkEnd w:id="123"/>
-    <w:bookmarkStart w:id="130" w:name="sec:limits"/>
+    <w:bookmarkEnd w:id="125"/>
+    <w:bookmarkEnd w:id="126"/>
+    <w:bookmarkStart w:id="133" w:name="sec:limits"/>
     <w:p>
       <w:pPr>
         <w:pStyle w:val="Heading1"/>
@@ -23464,7 +23889,7 @@
         <w:t xml:space="preserve">Limitations</w:t>
       </w:r>
     </w:p>
-    <w:bookmarkStart w:id="124" w:name="scope"/>
+    <w:bookmarkStart w:id="127" w:name="scope"/>
     <w:p>
       <w:pPr>
         <w:pStyle w:val="Heading4"/>
@@ -23518,8 +23943,8 @@
         <w:t xml:space="preserve">show that the size of the ratio depends on how many passages the reader sees. Results may differ for other domains, longer answers, larger or proprietary readers, other prompts or agentic pipelines. All timings come from one GPU type (Tesla T4) and one CPU configuration.</w:t>
       </w:r>
     </w:p>
-    <w:bookmarkEnd w:id="124"/>
-    <w:bookmarkStart w:id="125" w:name="corpus-and-labels"/>
+    <w:bookmarkEnd w:id="127"/>
+    <w:bookmarkStart w:id="128" w:name="corpus-and-labels"/>
     <w:p>
       <w:pPr>
         <w:pStyle w:val="Heading4"/>
@@ -23533,11 +23958,11 @@
         <w:pStyle w:val="FirstParagraph"/>
       </w:pPr>
       <w:r>
-        <w:t xml:space="preserve">Except for Phase 3, retrieval ran on 300,000-passage sub-corpora that contain every gold passage and favour the dense encoders relative to BM25. Phase 3 tested the NQ ratios on the full corpus for BM25, MiniLM-L6, bge-small and e5-base-v2 only; bge-base, bge-large, Qwen3-Embedding-0.6B and all of HotpotQA rest on the sub-corpus. NQ relevance labels are sparse. The answer-string check measures how often a miss still holds an answer, but it is lexical: it can count a passage that mentions the answer without supporting it, and it misses paraphrases. The registered blinded human audit of misses was not complete for this version. The joined NQ set covers 2,255 of 3,452 judged queries and may differ in difficulty from the excluded queries. A Phase 1 check found Hit@5 differences between joined and unjoined queries from −0.028 to +0.005 across the seven retrievers, and every 95% interval included zero.</w:t>
+        <w:t xml:space="preserve">Except for Phase 3, retrieval ran on 300,000-passage sub-corpora that contain every gold passage and favour the dense encoders relative to BM25. Phase 3 tested the NQ ratios on the full corpus for BM25, MiniLM-L6, bge-small and e5-base-v2 only; bge-base, bge-large, Qwen3-Embedding-0.6B and all of HotpotQA rest on the sub-corpus. NQ relevance labels are sparse. The answer-string check is lexical; the human audit agreed with it on most items but covers 100 misses of one encoder on the sub-corpus, labelled by one annotator, the author. The joined NQ set covers 2,255 of 3,452 judged queries and may differ in difficulty from the excluded queries. A Phase 1 check found Hit@5 differences between joined and unjoined queries from −0.028 to +0.005 across the seven retrievers, and every 95% interval included zero.</w:t>
       </w:r>
     </w:p>
-    <w:bookmarkEnd w:id="125"/>
-    <w:bookmarkStart w:id="126" w:name="metrics-and-statistics"/>
+    <w:bookmarkEnd w:id="128"/>
+    <w:bookmarkStart w:id="129" w:name="metrics-and-statistics"/>
     <w:p>
       <w:pPr>
         <w:pStyle w:val="Heading4"/>
@@ -23551,7 +23976,7 @@
         <w:pStyle w:val="FirstParagraph"/>
       </w:pPr>
       <w:r>
-        <w:t xml:space="preserve">EM is strict. We report F1 and answer containment, but did not judge correctness by hand. The transfer ratio is a ratio of means and becomes unstable when the retrieval gain is small; our reporting rule removes the worst cases, but the bge-small intervals on NQ still include zero. The ratio depends on the baseline encoder, and the share of the gain assigned to conditional EM depends on how the decomposition is ordered (Tables </w:t>
+        <w:t xml:space="preserve">EM is strict. We report F1 and answer containment; correctness was judged by hand only for the 100 audited misses. The transfer ratio is a ratio of means and becomes unstable when the retrieval gain is small; our reporting rule removes the worst cases, but the bge-small intervals on NQ still include zero. The ratio depends on the baseline encoder, and the share of the gain assigned to conditional EM depends on how the decomposition is ordered (Tables </w:t>
       </w:r>
       <w:hyperlink w:anchor="tab:altbase">
         <w:r>
@@ -23572,15 +23997,15 @@
           <w:rPr>
             <w:rStyle w:val="Hyperlink"/>
           </w:rPr>
-          <w:t xml:space="preserve">11</w:t>
+          <w:t xml:space="preserve">12</w:t>
         </w:r>
       </w:hyperlink>
       <w:r>
         <w:t xml:space="preserve">). The decomposition, the query-level accounting, the Both@5 ranking and ratios, the BM25 baseline and the GEE interaction model are post hoc. The accounting groups are defined by retrieval outcomes, so they locate the EM difference but do not explain it. The registered pooled GEE model assumed one retriever effect across datasets, which the interaction test did not support. Answer quality under approximate search was not measured. Multiplicity is controlled within each family, not across all tests in the paper. Bootstrap intervals, F1, answer containment and the pooled model were checked by a rerun on a second computer, not by an independent implementation.</w:t>
       </w:r>
     </w:p>
-    <w:bookmarkEnd w:id="126"/>
-    <w:bookmarkStart w:id="127" w:name="context-experiment"/>
+    <w:bookmarkEnd w:id="129"/>
+    <w:bookmarkStart w:id="130" w:name="context-experiment"/>
     <w:p>
       <w:pPr>
         <w:pStyle w:val="Heading4"/>
@@ -23597,8 +24022,8 @@
         <w:t xml:space="preserve">The hard negatives are top-ranked BM25 passages without a gold label, and a third of the questions had at least one that contained an answer string. Excluding those questions made the measured drop larger, so this does not weaken P5, but the subset analysis is a sensitivity check on 333 questions. The experiment used one reader and 500 questions. The random-passage control found no detected difference from the gold passage alone; it does not establish equivalence.</w:t>
       </w:r>
     </w:p>
-    <w:bookmarkEnd w:id="127"/>
-    <w:bookmarkStart w:id="128" w:name="judge-and-annotation"/>
+    <w:bookmarkEnd w:id="130"/>
+    <w:bookmarkStart w:id="131" w:name="judge-and-annotation"/>
     <w:p>
       <w:pPr>
         <w:pStyle w:val="Heading4"/>
@@ -23629,8 +24054,8 @@
         <w:t xml:space="preserve">= 0.127 the judge was excluded under the registered rule, so this limitation does not affect the conclusions, but no faithfulness result is reported.</w:t>
       </w:r>
     </w:p>
-    <w:bookmarkEnd w:id="128"/>
-    <w:bookmarkStart w:id="129" w:name="three-study-phases"/>
+    <w:bookmarkEnd w:id="131"/>
+    <w:bookmarkStart w:id="132" w:name="three-study-phases"/>
     <w:p>
       <w:pPr>
         <w:pStyle w:val="Heading4"/>
@@ -23661,9 +24086,9 @@
         <w:t xml:space="preserve">ablation were run before the predictions were registered, and the software image changed between Phases 1 and 2. P7 and P8 were registered after the sub-corpus results were known; they test whether those results replicate, not a new hypothesis. Within-cell comparisons share one environment. For comparisons across phases, 396 of 397 identical prompts gave identical outputs.</w:t>
       </w:r>
     </w:p>
-    <w:bookmarkEnd w:id="129"/>
-    <w:bookmarkEnd w:id="130"/>
-    <w:bookmarkStart w:id="131" w:name="sec:conclusion"/>
+    <w:bookmarkEnd w:id="132"/>
+    <w:bookmarkEnd w:id="133"/>
+    <w:bookmarkStart w:id="134" w:name="sec:conclusion"/>
     <w:p>
       <w:pPr>
         <w:pStyle w:val="Heading1"/>
@@ -23677,7 +24102,7 @@
         <w:pStyle w:val="FirstParagraph"/>
       </w:pPr>
       <w:r>
-        <w:t xml:space="preserve">We measured how much of a paired retrieval gain reaches the answer when a RAG system swaps one open embedding model for another. On single-hop NQ, between 0.16 and 0.27 EM points followed each Hit@5 point that a dense encoder gained over MiniLM-L6, for both readers; the ratio stayed well below 1 under other answer metrics and a BM25 baseline, held on the full NQ corpus in a registered rerun (0.15–0.23), and its size depended on the number of passages read (RQ1). The gain came from queries that newly retrieved a gold passage, partly offset by queries that kept or lost one, and many retrieval misses still contained the answer. On multi-hop HotpotQA, the Hit@5-based ratios were larger, but with Both@5 as the denominator they were 0.29 to 0.35, and the EM gain sat in queries for which the encoder retrieved more supporting passages. Among dense encoders, bge-large gave a small EM gain over e5-base-v2 on HotpotQA and none detectable on NQ, and Qwen3-Embedding-0.6B gave lower EM on HotpotQA (RQ2). Top-ranked non-gold passages lowered EM, gold position did not change it detectably, and ten passages narrowed the gaps between retrievers (RQ3). Retrieval-stage throughput differed 27-fold, approximate search returned nearly the same top passages, and on the full NQ corpus the four retrievers tested kept their order and their transfer ratios (RQ4).</w:t>
+        <w:t xml:space="preserve">We measured how much of a paired retrieval gain reaches the answer when a RAG system swaps one open embedding model for another. On single-hop NQ, between 0.16 and 0.27 EM points followed each Hit@5 point that a dense encoder gained over MiniLM-L6, for both readers; the ratio stayed well below 1 under other answer metrics and a BM25 baseline, held on the full NQ corpus in a registered rerun (0.15–0.23), and its size depended on the number of passages read (RQ1). The gain came from queries that newly retrieved a gold passage, partly offset by queries that kept or lost one, and many retrieval misses still contained the answer: 41 of 100 in a blinded human audit. On multi-hop HotpotQA, the Hit@5-based ratios were larger, but with Both@5 as the denominator they were 0.29 to 0.35, and the EM gain sat in queries for which the encoder retrieved more supporting passages. Among dense encoders, bge-large gave a small EM gain over e5-base-v2 on HotpotQA and none detectable on NQ, and Qwen3-Embedding-0.6B gave lower EM on HotpotQA (RQ2). Top-ranked non-gold passages lowered EM, gold position did not change it detectably, and ten passages narrowed the gaps between retrievers (RQ3). Retrieval-stage throughput differed 27-fold, approximate search returned nearly the same top passages, and on the full NQ corpus the four retrievers tested kept their order and their transfer ratios (RQ4).</w:t>
       </w:r>
     </w:p>
     <w:p>
@@ -23685,11 +24110,11 @@
         <w:pStyle w:val="BodyText"/>
       </w:pPr>
       <w:r>
-        <w:t xml:space="preserve">Within this setup, retrieval gains overstated answer gains, and Hit@5 hid much of the multi-hop retrieval gain. We recommend that RAG studies report answer gains next to retrieval gains, with paired intervals, the baseline and the reading depth stated, and that they score multi-hop retrieval by complete evidence. Future work should test larger readers, other domains and the multi-hop setting on a full corpus, run the readers on approximate-search results, and judge by hand whether the answer-bearing passages behind retrieval misses support the answer.</w:t>
+        <w:t xml:space="preserve">Within this setup, retrieval gains overstated answer gains, and Hit@5 hid much of the multi-hop retrieval gain. We recommend that RAG studies report answer gains next to retrieval gains, with paired intervals, the baseline and the reading depth stated, and that they score multi-hop retrieval by complete evidence. Future work should test larger readers, other domains and the multi-hop setting on a full corpus, run the readers on approximate-search results, and extend the human audit to more encoders, both corpora and a second annotator.</w:t>
       </w:r>
     </w:p>
-    <w:bookmarkEnd w:id="131"/>
-    <w:bookmarkStart w:id="136" w:name="ethics-statement"/>
+    <w:bookmarkEnd w:id="134"/>
+    <w:bookmarkStart w:id="139" w:name="ethics-statement"/>
     <w:p>
       <w:pPr>
         <w:pStyle w:val="Heading1"/>
@@ -23698,7 +24123,7 @@
         <w:t xml:space="preserve">Ethics statement</w:t>
       </w:r>
     </w:p>
-    <w:bookmarkStart w:id="132" w:name="data-and-licences"/>
+    <w:bookmarkStart w:id="135" w:name="data-and-licences"/>
     <w:p>
       <w:pPr>
         <w:pStyle w:val="Heading4"/>
@@ -23715,8 +24140,8 @@
         <w:t xml:space="preserve">We used public resources under their licences, as listed on their Hugging Face cards (accessed 17 October 2026): the BEIR versions of Natural Questions and HotpotQA (CC BY-SA 4.0), NQ-open (CC BY-SA 3.0) and HotpotQA (CC BY-SA 4.0). The encoders are released under Apache-2.0 (all-MiniLM-L6-v2, Qwen3-Embedding-0.6B) or MIT (bge, e5 and bge-reranker-base); Qwen2.5-7B-Instruct-AWQ and Mistral-7B-Instruct-v0.3 under Apache-2.0; and the Llama-3.1-8B-Instruct AWQ build under the Llama 3.1 Community License. We used each for research evaluation. The questions are public benchmark questions over Wikipedia; we collected no personal data.</w:t>
       </w:r>
     </w:p>
-    <w:bookmarkEnd w:id="132"/>
-    <w:bookmarkStart w:id="133" w:name="human-annotation"/>
+    <w:bookmarkEnd w:id="135"/>
+    <w:bookmarkStart w:id="136" w:name="human-annotation"/>
     <w:p>
       <w:pPr>
         <w:pStyle w:val="Heading4"/>
@@ -23733,8 +24158,8 @@
         <w:t xml:space="preserve">The 200 judge-validation items were labelled by one member of the study team, with the same instructions the judge received and without seeing its verdicts. No external participants were involved.</w:t>
       </w:r>
     </w:p>
-    <w:bookmarkEnd w:id="133"/>
-    <w:bookmarkStart w:id="134" w:name="risks"/>
+    <w:bookmarkEnd w:id="136"/>
+    <w:bookmarkStart w:id="137" w:name="risks"/>
     <w:p>
       <w:pPr>
         <w:pStyle w:val="Heading4"/>
@@ -23751,8 +24176,8 @@
         <w:t xml:space="preserve">The study compares existing models and creates no new model. Readers may over-generalise the comparison to other readers, corpora or languages; we scope each claim to the tested setup. The excluded LLM judge should not be used as evidence that a system gives faithful answers.</w:t>
       </w:r>
     </w:p>
-    <w:bookmarkEnd w:id="134"/>
-    <w:bookmarkStart w:id="135" w:name="compute"/>
+    <w:bookmarkEnd w:id="137"/>
+    <w:bookmarkStart w:id="138" w:name="compute"/>
     <w:p>
       <w:pPr>
         <w:pStyle w:val="Heading4"/>
@@ -23769,9 +24194,9 @@
         <w:t xml:space="preserve">All experiments ran on free Kaggle sessions with Tesla T4 GPUs; the study had no monetary cost.</w:t>
       </w:r>
     </w:p>
-    <w:bookmarkEnd w:id="135"/>
-    <w:bookmarkEnd w:id="136"/>
-    <w:bookmarkStart w:id="137" w:name="data-and-code-availability"/>
+    <w:bookmarkEnd w:id="138"/>
+    <w:bookmarkEnd w:id="139"/>
+    <w:bookmarkStart w:id="140" w:name="data-and-code-availability"/>
     <w:p>
       <w:pPr>
         <w:pStyle w:val="Heading1"/>
@@ -23799,8 +24224,8 @@
         <w:t xml:space="preserve">. Every number in this paper is generated by script from the committed outputs, including the post hoc analyses, whose scripts are in the same repository.</w:t>
       </w:r>
     </w:p>
-    <w:bookmarkEnd w:id="137"/>
-    <w:bookmarkStart w:id="138" w:name="X1f74eb43af444059c7518034463b6c89b1cacf4"/>
+    <w:bookmarkEnd w:id="140"/>
+    <w:bookmarkStart w:id="141" w:name="X1f74eb43af444059c7518034463b6c89b1cacf4"/>
     <w:p>
       <w:pPr>
         <w:pStyle w:val="Heading1"/>
@@ -23817,8 +24242,8 @@
         <w:t xml:space="preserve">During the preparation of this work the author used Claude (Anthropic) to write and test analysis and experiment code, to check references against bibliographic databases, and to draft and edit text. After using this tool, the author reviewed and edited the content as needed and takes full responsibility for the content of the published article. Figures and tables were generated by scripts from the experimental data.</w:t>
       </w:r>
     </w:p>
-    <w:bookmarkEnd w:id="138"/>
-    <w:bookmarkStart w:id="143" w:name="app:prompts"/>
+    <w:bookmarkEnd w:id="141"/>
+    <w:bookmarkStart w:id="146" w:name="app:prompts"/>
     <w:p>
       <w:pPr>
         <w:pStyle w:val="Heading1"/>
@@ -23844,7 +24269,7 @@
         <w:t xml:space="preserve">). Every generation record stores a hash of the system prompt; all 131,855 scored answers carry the hash of the prompt printed here (A1: 122,545, A2: 8,510, A3: 800 records). Each prompt was rendered with the reader’s own chat template.</w:t>
       </w:r>
     </w:p>
-    <w:bookmarkStart w:id="139" w:name="user-message-a1-and-a3"/>
+    <w:bookmarkStart w:id="142" w:name="user-message-a1-and-a3"/>
     <w:p>
       <w:pPr>
         <w:pStyle w:val="Heading4"/>
@@ -23958,8 +24383,8 @@
         <w:t xml:space="preserve">Answer:</w:t>
       </w:r>
     </w:p>
-    <w:bookmarkEnd w:id="139"/>
-    <w:bookmarkStart w:id="140" w:name="a1-main-prompt-with-passages"/>
+    <w:bookmarkEnd w:id="142"/>
+    <w:bookmarkStart w:id="143" w:name="a1-main-prompt-with-passages"/>
     <w:p>
       <w:pPr>
         <w:pStyle w:val="Heading4"/>
@@ -24000,8 +24425,8 @@
         <w:t xml:space="preserve">”</w:t>
       </w:r>
     </w:p>
-    <w:bookmarkEnd w:id="140"/>
-    <w:bookmarkStart w:id="141" w:name="a2-closed-book"/>
+    <w:bookmarkEnd w:id="143"/>
+    <w:bookmarkStart w:id="144" w:name="a2-closed-book"/>
     <w:p>
       <w:pPr>
         <w:pStyle w:val="Heading4"/>
@@ -24075,8 +24500,8 @@
         <w:t xml:space="preserve">.</w:t>
       </w:r>
     </w:p>
-    <w:bookmarkEnd w:id="141"/>
-    <w:bookmarkStart w:id="142" w:name="a3-abstention-check-phase-1-only"/>
+    <w:bookmarkEnd w:id="144"/>
+    <w:bookmarkStart w:id="145" w:name="a3-abstention-check-phase-1-only"/>
     <w:p>
       <w:pPr>
         <w:pStyle w:val="Heading4"/>
@@ -24131,9 +24556,9 @@
         <w:t xml:space="preserve">The gold-passage condition uses A1 with the gold passages only.</w:t>
       </w:r>
     </w:p>
-    <w:bookmarkEnd w:id="142"/>
-    <w:bookmarkEnd w:id="143"/>
-    <w:bookmarkStart w:id="144" w:name="app:judge"/>
+    <w:bookmarkEnd w:id="145"/>
+    <w:bookmarkEnd w:id="146"/>
+    <w:bookmarkStart w:id="147" w:name="app:judge"/>
     <w:p>
       <w:pPr>
         <w:pStyle w:val="Heading1"/>
@@ -24269,8 +24694,8 @@
         <w:t xml:space="preserve">The 200 items were drawn by a seeded, stratified sampler that over-represents NOT_SUPPORTED verdicts; population-weighted statistics use the inverse inclusion probabilities.</w:t>
       </w:r>
     </w:p>
-    <w:bookmarkEnd w:id="144"/>
-    <w:bookmarkStart w:id="147" w:name="app:repro"/>
+    <w:bookmarkEnd w:id="147"/>
+    <w:bookmarkStart w:id="150" w:name="app:repro"/>
     <w:p>
       <w:pPr>
         <w:pStyle w:val="Heading1"/>
@@ -24279,7 +24704,7 @@
         <w:t xml:space="preserve">Models, data and software</w:t>
       </w:r>
     </w:p>
-    <w:bookmarkStart w:id="145" w:name="tab:revisions"/>
+    <w:bookmarkStart w:id="148" w:name="tab:revisions"/>
     <w:p>
       <w:pPr>
         <w:pStyle w:val="TableCaption"/>
@@ -24746,7 +25171,7 @@
         </w:tc>
       </w:tr>
     </w:tbl>
-    <w:bookmarkEnd w:id="145"/>
+    <w:bookmarkEnd w:id="148"/>
     <w:p>
       <w:pPr>
         <w:pStyle w:val="BodyText"/>
@@ -26323,7 +26748,7 @@
         <w:t xml:space="preserve">. Qwen3-Embedding uses a task instruction per dataset.</w:t>
       </w:r>
     </w:p>
-    <w:bookmarkStart w:id="146" w:name="tab:data"/>
+    <w:bookmarkStart w:id="149" w:name="tab:data"/>
     <w:p>
       <w:pPr>
         <w:pStyle w:val="TableCaption"/>
@@ -26849,7 +27274,7 @@
         </w:tc>
       </w:tr>
     </w:tbl>
-    <w:bookmarkEnd w:id="146"/>
+    <w:bookmarkEnd w:id="149"/>
     <w:p>
       <w:pPr>
         <w:pStyle w:val="BodyText"/>
@@ -26862,8 +27287,8 @@
         <w:t xml:space="preserve">Corpus sizes as distributed by BEIR. Joins: NQ by normalised question text, HotpotQA by question id. Each HotpotQA query has exactly two distinct gold passages; 14,810 gold references point to 13,783 distinct passages because some passages support several questions. Both@5 requires both gold passages of the query in the top five.</w:t>
       </w:r>
     </w:p>
-    <w:bookmarkEnd w:id="147"/>
-    <w:bookmarkStart w:id="148" w:name="app:prereg"/>
+    <w:bookmarkEnd w:id="150"/>
+    <w:bookmarkStart w:id="151" w:name="app:prereg"/>
     <w:p>
       <w:pPr>
         <w:pStyle w:val="Heading1"/>
@@ -27056,8 +27481,8 @@
         <w:t xml:space="preserve">Pilot numbers were used only for planning and are not reported as results.</w:t>
       </w:r>
     </w:p>
-    <w:bookmarkEnd w:id="148"/>
-    <w:bookmarkStart w:id="152" w:name="app:deploy"/>
+    <w:bookmarkEnd w:id="151"/>
+    <w:bookmarkStart w:id="155" w:name="app:deploy"/>
     <w:p>
       <w:pPr>
         <w:pStyle w:val="Heading1"/>
@@ -27122,18 +27547,18 @@
           <wp:inline>
             <wp:extent cx="5334000" cy="3514470"/>
             <wp:effectExtent b="0" l="0" r="0" t="0"/>
-            <wp:docPr descr="" title="" id="150" name="Picture"/>
+            <wp:docPr descr="" title="" id="153" name="Picture"/>
             <a:graphic>
               <a:graphicData uri="http://schemas.openxmlformats.org/drawingml/2006/picture">
                 <pic:pic>
                   <pic:nvPicPr>
-                    <pic:cNvPr descr="/home/claude/rag-embed-transfer/paper_figures/out/fig11_pareto.png" id="151" name="Picture"/>
+                    <pic:cNvPr descr="/home/claude/rag-embed-transfer/paper_figures/out/fig11_pareto.png" id="154" name="Picture"/>
                     <pic:cNvPicPr>
                       <a:picLocks noChangeArrowheads="1" noChangeAspect="1"/>
                     </pic:cNvPicPr>
                   </pic:nvPicPr>
                   <pic:blipFill>
-                    <a:blip r:embed="rId149"/>
+                    <a:blip r:embed="rId152"/>
                     <a:stretch>
                       <a:fillRect/>
                     </a:stretch>
@@ -28114,7 +28539,7 @@
             <w:iCs/>
             <w:i/>
           </w:rPr>
-          <w:t xml:space="preserve">6</w:t>
+          <w:t xml:space="preserve">7</w:t>
         </w:r>
       </w:hyperlink>
       <w:r>
@@ -28125,8 +28550,8 @@
         <w:t xml:space="preserve">.</w:t>
       </w:r>
     </w:p>
-    <w:bookmarkEnd w:id="152"/>
-    <w:bookmarkStart w:id="258" w:name="app:tables"/>
+    <w:bookmarkEnd w:id="155"/>
+    <w:bookmarkStart w:id="261" w:name="app:tables"/>
     <w:p>
       <w:pPr>
         <w:pStyle w:val="Heading1"/>
@@ -28211,7 +28636,7 @@
           <w:rPr>
             <w:rStyle w:val="Hyperlink"/>
           </w:rPr>
-          <w:t xml:space="preserve">12</w:t>
+          <w:t xml:space="preserve">13</w:t>
         </w:r>
       </w:hyperlink>
       <w:r>
@@ -28264,7 +28689,7 @@
           <w:rPr>
             <w:rStyle w:val="Hyperlink"/>
           </w:rPr>
-          <w:t xml:space="preserve">13</w:t>
+          <w:t xml:space="preserve">14</w:t>
         </w:r>
       </w:hyperlink>
       <w:r>
@@ -28306,7 +28731,7 @@
           <w:rPr>
             <w:rStyle w:val="Hyperlink"/>
           </w:rPr>
-          <w:t xml:space="preserve">11</w:t>
+          <w:t xml:space="preserve">12</w:t>
         </w:r>
       </w:hyperlink>
       <w:r>
@@ -34693,7 +35118,7 @@
         <w:t xml:space="preserve">, seed 0); each query keeps its group, so group sizes vary across resamples and the interval is for the group’s contribution to the population EM difference.</w:t>
       </w:r>
     </w:p>
-    <w:bookmarkStart w:id="153" w:name="tab:share"/>
+    <w:bookmarkStart w:id="156" w:name="tab:share"/>
     <w:p>
       <w:pPr>
         <w:pStyle w:val="TableCaption"/>
@@ -35157,7 +35582,7 @@
         </w:tc>
       </w:tr>
     </w:tbl>
-    <w:bookmarkEnd w:id="153"/>
+    <w:bookmarkEnd w:id="156"/>
     <w:p>
       <w:pPr>
         <w:pStyle w:val="BodyText"/>
@@ -37559,7 +37984,7 @@
         <w:t xml:space="preserve">Closed-book EM for comparison: NQ 0.149 (Qwen), 0.197 (Llama); HotpotQA 0.158 (Qwen), 0.148 (Llama).</w:t>
       </w:r>
     </w:p>
-    <w:bookmarkStart w:id="154" w:name="tab:idk"/>
+    <w:bookmarkStart w:id="157" w:name="tab:idk"/>
     <w:p>
       <w:pPr>
         <w:pStyle w:val="TableCaption"/>
@@ -38149,7 +38574,7 @@
         </w:tc>
       </w:tr>
     </w:tbl>
-    <w:bookmarkEnd w:id="154"/>
+    <w:bookmarkEnd w:id="157"/>
     <w:p>
       <w:pPr>
         <w:pStyle w:val="BodyText"/>
@@ -41891,7 +42316,7 @@
         <w:t xml:space="preserve">).</w:t>
       </w:r>
     </w:p>
-    <w:bookmarkStart w:id="155" w:name="tab:judgerates"/>
+    <w:bookmarkStart w:id="158" w:name="tab:judgerates"/>
     <w:p>
       <w:pPr>
         <w:pStyle w:val="TableCaption"/>
@@ -42299,7 +42724,7 @@
         </w:tc>
       </w:tr>
     </w:tbl>
-    <w:bookmarkEnd w:id="155"/>
+    <w:bookmarkEnd w:id="158"/>
     <w:p>
       <w:pPr>
         <w:pStyle w:val="BodyText"/>
@@ -42321,18 +42746,18 @@
           <wp:inline>
             <wp:extent cx="5334000" cy="1649855"/>
             <wp:effectExtent b="0" l="0" r="0" t="0"/>
-            <wp:docPr descr="" title="" id="157" name="Picture"/>
+            <wp:docPr descr="" title="" id="160" name="Picture"/>
             <a:graphic>
               <a:graphicData uri="http://schemas.openxmlformats.org/drawingml/2006/picture">
                 <pic:pic>
                   <pic:nvPicPr>
-                    <pic:cNvPr descr="/home/claude/rag-embed-transfer/paper_figures/out/fig12_latency.png" id="158" name="Picture"/>
+                    <pic:cNvPr descr="/home/claude/rag-embed-transfer/paper_figures/out/fig12_latency.png" id="161" name="Picture"/>
                     <pic:cNvPicPr>
                       <a:picLocks noChangeArrowheads="1" noChangeAspect="1"/>
                     </pic:cNvPicPr>
                   </pic:nvPicPr>
                   <pic:blipFill>
-                    <a:blip r:embed="rId156"/>
+                    <a:blip r:embed="rId159"/>
                     <a:stretch>
                       <a:fillRect/>
                     </a:stretch>
@@ -42367,8 +42792,8 @@
         <w:t xml:space="preserve">NQ nDCG@10 against per-query latency (Phase 1 batch-1 medians, log scale): (a) query encoding on the T4 and exact search on the CPU; (b) both on the CPU.</w:t>
       </w:r>
     </w:p>
-    <w:bookmarkStart w:id="257" w:name="refs"/>
-    <w:bookmarkStart w:id="160" w:name="ref-amiraz2025distracting"/>
+    <w:bookmarkStart w:id="260" w:name="refs"/>
+    <w:bookmarkStart w:id="163" w:name="ref-amiraz2025distracting"/>
     <w:p>
       <w:pPr>
         <w:pStyle w:val="Bibliography"/>
@@ -42410,7 +42835,7 @@
       <w:r>
         <w:t xml:space="preserve"> </w:t>
       </w:r>
-      <w:hyperlink r:id="rId159">
+      <w:hyperlink r:id="rId162">
         <w:r>
           <w:rPr>
             <w:rStyle w:val="Hyperlink"/>
@@ -42422,8 +42847,8 @@
         <w:t xml:space="preserve">.</w:t>
       </w:r>
     </w:p>
-    <w:bookmarkEnd w:id="160"/>
-    <w:bookmarkStart w:id="161" w:name="ref-elassadi2026embedder"/>
+    <w:bookmarkEnd w:id="163"/>
+    <w:bookmarkStart w:id="164" w:name="ref-elassadi2026embedder"/>
     <w:p>
       <w:pPr>
         <w:pStyle w:val="Bibliography"/>
@@ -42447,8 +42872,8 @@
         <w:t xml:space="preserve"> arXiv preprint arXiv:2608.12875.</w:t>
       </w:r>
     </w:p>
-    <w:bookmarkEnd w:id="161"/>
-    <w:bookmarkStart w:id="162" w:name="ref-bala2026recall"/>
+    <w:bookmarkEnd w:id="164"/>
+    <w:bookmarkStart w:id="165" w:name="ref-bala2026recall"/>
     <w:p>
       <w:pPr>
         <w:pStyle w:val="Bibliography"/>
@@ -42475,8 +42900,8 @@
         <w:t xml:space="preserve">arXiv preprint arXiv:2607.00725.</w:t>
       </w:r>
     </w:p>
-    <w:bookmarkEnd w:id="162"/>
-    <w:bookmarkStart w:id="164" w:name="ref-cohen1960kappa"/>
+    <w:bookmarkEnd w:id="165"/>
+    <w:bookmarkStart w:id="167" w:name="ref-cohen1960kappa"/>
     <w:p>
       <w:pPr>
         <w:pStyle w:val="Bibliography"/>
@@ -42515,7 +42940,7 @@
       <w:r>
         <w:t xml:space="preserve"> </w:t>
       </w:r>
-      <w:hyperlink r:id="rId163">
+      <w:hyperlink r:id="rId166">
         <w:r>
           <w:rPr>
             <w:rStyle w:val="Hyperlink"/>
@@ -42527,8 +42952,8 @@
         <w:t xml:space="preserve">.</w:t>
       </w:r>
     </w:p>
-    <w:bookmarkEnd w:id="164"/>
-    <w:bookmarkStart w:id="166" w:name="ref-cuconasu2025positional"/>
+    <w:bookmarkEnd w:id="167"/>
+    <w:bookmarkStart w:id="169" w:name="ref-cuconasu2025positional"/>
     <w:p>
       <w:pPr>
         <w:pStyle w:val="Bibliography"/>
@@ -42567,7 +42992,7 @@
       <w:r>
         <w:t xml:space="preserve"> </w:t>
       </w:r>
-      <w:hyperlink r:id="rId165">
+      <w:hyperlink r:id="rId168">
         <w:r>
           <w:rPr>
             <w:rStyle w:val="Hyperlink"/>
@@ -42579,8 +43004,8 @@
         <w:t xml:space="preserve">.</w:t>
       </w:r>
     </w:p>
-    <w:bookmarkEnd w:id="166"/>
-    <w:bookmarkStart w:id="168" w:name="ref-cuconasu2024power"/>
+    <w:bookmarkEnd w:id="169"/>
+    <w:bookmarkStart w:id="171" w:name="ref-cuconasu2024power"/>
     <w:p>
       <w:pPr>
         <w:pStyle w:val="Bibliography"/>
@@ -42622,7 +43047,7 @@
       <w:r>
         <w:t xml:space="preserve"> </w:t>
       </w:r>
-      <w:hyperlink r:id="rId167">
+      <w:hyperlink r:id="rId170">
         <w:r>
           <w:rPr>
             <w:rStyle w:val="Hyperlink"/>
@@ -42634,8 +43059,8 @@
         <w:t xml:space="preserve">.</w:t>
       </w:r>
     </w:p>
-    <w:bookmarkEnd w:id="168"/>
-    <w:bookmarkStart w:id="170" w:name="ref-dror2018"/>
+    <w:bookmarkEnd w:id="171"/>
+    <w:bookmarkStart w:id="173" w:name="ref-dror2018"/>
     <w:p>
       <w:pPr>
         <w:pStyle w:val="Bibliography"/>
@@ -42677,7 +43102,7 @@
       <w:r>
         <w:t xml:space="preserve"> </w:t>
       </w:r>
-      <w:hyperlink r:id="rId169">
+      <w:hyperlink r:id="rId172">
         <w:r>
           <w:rPr>
             <w:rStyle w:val="Hyperlink"/>
@@ -42689,8 +43114,8 @@
         <w:t xml:space="preserve">.</w:t>
       </w:r>
     </w:p>
-    <w:bookmarkEnd w:id="170"/>
-    <w:bookmarkStart w:id="172" w:name="ref-efron1993bootstrap"/>
+    <w:bookmarkEnd w:id="173"/>
+    <w:bookmarkStart w:id="175" w:name="ref-efron1993bootstrap"/>
     <w:p>
       <w:pPr>
         <w:pStyle w:val="Bibliography"/>
@@ -42714,7 +43139,7 @@
       <w:r>
         <w:t xml:space="preserve"> </w:t>
       </w:r>
-      <w:hyperlink r:id="rId171">
+      <w:hyperlink r:id="rId174">
         <w:r>
           <w:rPr>
             <w:rStyle w:val="Hyperlink"/>
@@ -42726,8 +43151,8 @@
         <w:t xml:space="preserve">.</w:t>
       </w:r>
     </w:p>
-    <w:bookmarkEnd w:id="172"/>
-    <w:bookmarkStart w:id="174" w:name="ref-es2024ragas"/>
+    <w:bookmarkEnd w:id="175"/>
+    <w:bookmarkStart w:id="177" w:name="ref-es2024ragas"/>
     <w:p>
       <w:pPr>
         <w:pStyle w:val="Bibliography"/>
@@ -42769,7 +43194,7 @@
       <w:r>
         <w:t xml:space="preserve"> </w:t>
       </w:r>
-      <w:hyperlink r:id="rId173">
+      <w:hyperlink r:id="rId176">
         <w:r>
           <w:rPr>
             <w:rStyle w:val="Hyperlink"/>
@@ -42781,8 +43206,8 @@
         <w:t xml:space="preserve">.</w:t>
       </w:r>
     </w:p>
-    <w:bookmarkEnd w:id="174"/>
-    <w:bookmarkStart w:id="175" w:name="ref-ghosh2026evidence"/>
+    <w:bookmarkEnd w:id="177"/>
+    <w:bookmarkStart w:id="178" w:name="ref-ghosh2026evidence"/>
     <w:p>
       <w:pPr>
         <w:pStyle w:val="Bibliography"/>
@@ -42809,8 +43234,8 @@
         <w:t xml:space="preserve">arXiv preprint arXiv:2608.26379.</w:t>
       </w:r>
     </w:p>
-    <w:bookmarkEnd w:id="175"/>
-    <w:bookmarkStart w:id="176" w:name="ref-grattafiori2024llama3"/>
+    <w:bookmarkEnd w:id="178"/>
+    <w:bookmarkStart w:id="179" w:name="ref-grattafiori2024llama3"/>
     <w:p>
       <w:pPr>
         <w:pStyle w:val="Bibliography"/>
@@ -42837,8 +43262,8 @@
         <w:t xml:space="preserve">arXiv preprint arXiv:2407.21783.</w:t>
       </w:r>
     </w:p>
-    <w:bookmarkEnd w:id="176"/>
-    <w:bookmarkStart w:id="178" w:name="ref-hitl2026comparative"/>
+    <w:bookmarkEnd w:id="179"/>
+    <w:bookmarkStart w:id="181" w:name="ref-hitl2026comparative"/>
     <w:p>
       <w:pPr>
         <w:pStyle w:val="Bibliography"/>
@@ -42874,7 +43299,7 @@
       <w:r>
         <w:t xml:space="preserve"> </w:t>
       </w:r>
-      <w:hyperlink r:id="rId177">
+      <w:hyperlink r:id="rId180">
         <w:r>
           <w:rPr>
             <w:rStyle w:val="Hyperlink"/>
@@ -42886,8 +43311,8 @@
         <w:t xml:space="preserve">.</w:t>
       </w:r>
     </w:p>
-    <w:bookmarkEnd w:id="178"/>
-    <w:bookmarkStart w:id="180" w:name="ref-holm1979"/>
+    <w:bookmarkEnd w:id="181"/>
+    <w:bookmarkStart w:id="183" w:name="ref-holm1979"/>
     <w:p>
       <w:pPr>
         <w:pStyle w:val="Bibliography"/>
@@ -42920,7 +43345,7 @@
       <w:r>
         <w:t xml:space="preserve"> </w:t>
       </w:r>
-      <w:hyperlink r:id="rId179">
+      <w:hyperlink r:id="rId182">
         <w:r>
           <w:rPr>
             <w:rStyle w:val="Hyperlink"/>
@@ -42932,8 +43357,8 @@
         <w:t xml:space="preserve">.</w:t>
       </w:r>
     </w:p>
-    <w:bookmarkEnd w:id="180"/>
-    <w:bookmarkStart w:id="181" w:name="ref-hsia2025ragged"/>
+    <w:bookmarkEnd w:id="183"/>
+    <w:bookmarkStart w:id="184" w:name="ref-hsia2025ragged"/>
     <w:p>
       <w:pPr>
         <w:pStyle w:val="Bibliography"/>
@@ -42973,8 +43398,8 @@
         <w:t xml:space="preserve">.</w:t>
       </w:r>
     </w:p>
-    <w:bookmarkEnd w:id="181"/>
-    <w:bookmarkStart w:id="183" w:name="ref-izacard2021fid"/>
+    <w:bookmarkEnd w:id="184"/>
+    <w:bookmarkStart w:id="186" w:name="ref-izacard2021fid"/>
     <w:p>
       <w:pPr>
         <w:pStyle w:val="Bibliography"/>
@@ -43016,7 +43441,7 @@
       <w:r>
         <w:t xml:space="preserve"> </w:t>
       </w:r>
-      <w:hyperlink r:id="rId182">
+      <w:hyperlink r:id="rId185">
         <w:r>
           <w:rPr>
             <w:rStyle w:val="Hyperlink"/>
@@ -43028,8 +43453,8 @@
         <w:t xml:space="preserve">.</w:t>
       </w:r>
     </w:p>
-    <w:bookmarkEnd w:id="183"/>
-    <w:bookmarkStart w:id="184" w:name="ref-jiang2023mistral"/>
+    <w:bookmarkEnd w:id="186"/>
+    <w:bookmarkStart w:id="187" w:name="ref-jiang2023mistral"/>
     <w:p>
       <w:pPr>
         <w:pStyle w:val="Bibliography"/>
@@ -43056,8 +43481,8 @@
         <w:t xml:space="preserve">arXiv preprint arXiv:2310.06825.</w:t>
       </w:r>
     </w:p>
-    <w:bookmarkEnd w:id="184"/>
-    <w:bookmarkStart w:id="185" w:name="ref-jin2024longcontext"/>
+    <w:bookmarkEnd w:id="187"/>
+    <w:bookmarkStart w:id="188" w:name="ref-jin2024longcontext"/>
     <w:p>
       <w:pPr>
         <w:pStyle w:val="Bibliography"/>
@@ -43084,8 +43509,8 @@
         <w:t xml:space="preserve">arXiv preprint arXiv:2410.05983.</w:t>
       </w:r>
     </w:p>
-    <w:bookmarkEnd w:id="185"/>
-    <w:bookmarkStart w:id="187" w:name="ref-johnson2021faiss"/>
+    <w:bookmarkEnd w:id="188"/>
+    <w:bookmarkStart w:id="190" w:name="ref-johnson2021faiss"/>
     <w:p>
       <w:pPr>
         <w:pStyle w:val="Bibliography"/>
@@ -43124,7 +43549,7 @@
       <w:r>
         <w:t xml:space="preserve"> </w:t>
       </w:r>
-      <w:hyperlink r:id="rId186">
+      <w:hyperlink r:id="rId189">
         <w:r>
           <w:rPr>
             <w:rStyle w:val="Hyperlink"/>
@@ -43136,8 +43561,8 @@
         <w:t xml:space="preserve">.</w:t>
       </w:r>
     </w:p>
-    <w:bookmarkEnd w:id="187"/>
-    <w:bookmarkStart w:id="189" w:name="ref-kamalloo2023"/>
+    <w:bookmarkEnd w:id="190"/>
+    <w:bookmarkStart w:id="192" w:name="ref-kamalloo2023"/>
     <w:p>
       <w:pPr>
         <w:pStyle w:val="Bibliography"/>
@@ -43179,7 +43604,7 @@
       <w:r>
         <w:t xml:space="preserve"> </w:t>
       </w:r>
-      <w:hyperlink r:id="rId188">
+      <w:hyperlink r:id="rId191">
         <w:r>
           <w:rPr>
             <w:rStyle w:val="Hyperlink"/>
@@ -43191,8 +43616,8 @@
         <w:t xml:space="preserve">.</w:t>
       </w:r>
     </w:p>
-    <w:bookmarkEnd w:id="189"/>
-    <w:bookmarkStart w:id="191" w:name="ref-karpukhin2020dpr"/>
+    <w:bookmarkEnd w:id="192"/>
+    <w:bookmarkStart w:id="194" w:name="ref-karpukhin2020dpr"/>
     <w:p>
       <w:pPr>
         <w:pStyle w:val="Bibliography"/>
@@ -43234,7 +43659,7 @@
       <w:r>
         <w:t xml:space="preserve"> </w:t>
       </w:r>
-      <w:hyperlink r:id="rId190">
+      <w:hyperlink r:id="rId193">
         <w:r>
           <w:rPr>
             <w:rStyle w:val="Hyperlink"/>
@@ -43246,8 +43671,8 @@
         <w:t xml:space="preserve">.</w:t>
       </w:r>
     </w:p>
-    <w:bookmarkEnd w:id="191"/>
-    <w:bookmarkStart w:id="193" w:name="ref-kwiatkowski2019nq"/>
+    <w:bookmarkEnd w:id="194"/>
+    <w:bookmarkStart w:id="196" w:name="ref-kwiatkowski2019nq"/>
     <w:p>
       <w:pPr>
         <w:pStyle w:val="Bibliography"/>
@@ -43286,7 +43711,7 @@
       <w:r>
         <w:t xml:space="preserve"> </w:t>
       </w:r>
-      <w:hyperlink r:id="rId192">
+      <w:hyperlink r:id="rId195">
         <w:r>
           <w:rPr>
             <w:rStyle w:val="Hyperlink"/>
@@ -43298,8 +43723,8 @@
         <w:t xml:space="preserve">.</w:t>
       </w:r>
     </w:p>
-    <w:bookmarkEnd w:id="193"/>
-    <w:bookmarkStart w:id="195" w:name="ref-kwon2023vllm"/>
+    <w:bookmarkEnd w:id="196"/>
+    <w:bookmarkStart w:id="198" w:name="ref-kwon2023vllm"/>
     <w:p>
       <w:pPr>
         <w:pStyle w:val="Bibliography"/>
@@ -43341,7 +43766,7 @@
       <w:r>
         <w:t xml:space="preserve"> </w:t>
       </w:r>
-      <w:hyperlink r:id="rId194">
+      <w:hyperlink r:id="rId197">
         <w:r>
           <w:rPr>
             <w:rStyle w:val="Hyperlink"/>
@@ -43353,8 +43778,8 @@
         <w:t xml:space="preserve">.</w:t>
       </w:r>
     </w:p>
-    <w:bookmarkEnd w:id="195"/>
-    <w:bookmarkStart w:id="197" w:name="ref-landis1977"/>
+    <w:bookmarkEnd w:id="198"/>
+    <w:bookmarkStart w:id="200" w:name="ref-landis1977"/>
     <w:p>
       <w:pPr>
         <w:pStyle w:val="Bibliography"/>
@@ -43393,7 +43818,7 @@
       <w:r>
         <w:t xml:space="preserve"> </w:t>
       </w:r>
-      <w:hyperlink r:id="rId196">
+      <w:hyperlink r:id="rId199">
         <w:r>
           <w:rPr>
             <w:rStyle w:val="Hyperlink"/>
@@ -43405,8 +43830,8 @@
         <w:t xml:space="preserve">.</w:t>
       </w:r>
     </w:p>
-    <w:bookmarkEnd w:id="197"/>
-    <w:bookmarkStart w:id="199" w:name="ref-lee2019orqa"/>
+    <w:bookmarkEnd w:id="200"/>
+    <w:bookmarkStart w:id="202" w:name="ref-lee2019orqa"/>
     <w:p>
       <w:pPr>
         <w:pStyle w:val="Bibliography"/>
@@ -43448,7 +43873,7 @@
       <w:r>
         <w:t xml:space="preserve"> </w:t>
       </w:r>
-      <w:hyperlink r:id="rId198">
+      <w:hyperlink r:id="rId201">
         <w:r>
           <w:rPr>
             <w:rStyle w:val="Hyperlink"/>
@@ -43460,8 +43885,8 @@
         <w:t xml:space="preserve">.</w:t>
       </w:r>
     </w:p>
-    <w:bookmarkEnd w:id="199"/>
-    <w:bookmarkStart w:id="200" w:name="ref-leto2024toward"/>
+    <w:bookmarkEnd w:id="202"/>
+    <w:bookmarkStart w:id="203" w:name="ref-leto2024toward"/>
     <w:p>
       <w:pPr>
         <w:pStyle w:val="Bibliography"/>
@@ -43488,8 +43913,8 @@
         <w:t xml:space="preserve">arXiv preprint arXiv:2411.07396.</w:t>
       </w:r>
     </w:p>
-    <w:bookmarkEnd w:id="200"/>
-    <w:bookmarkStart w:id="201" w:name="ref-lewis2020rag"/>
+    <w:bookmarkEnd w:id="203"/>
+    <w:bookmarkStart w:id="204" w:name="ref-lewis2020rag"/>
     <w:p>
       <w:pPr>
         <w:pStyle w:val="Bibliography"/>
@@ -43529,8 +43954,8 @@
         <w:t xml:space="preserve">.</w:t>
       </w:r>
     </w:p>
-    <w:bookmarkEnd w:id="201"/>
-    <w:bookmarkStart w:id="203" w:name="ref-liang1986gee"/>
+    <w:bookmarkEnd w:id="204"/>
+    <w:bookmarkStart w:id="206" w:name="ref-liang1986gee"/>
     <w:p>
       <w:pPr>
         <w:pStyle w:val="Bibliography"/>
@@ -43569,7 +43994,7 @@
       <w:r>
         <w:t xml:space="preserve"> </w:t>
       </w:r>
-      <w:hyperlink r:id="rId202">
+      <w:hyperlink r:id="rId205">
         <w:r>
           <w:rPr>
             <w:rStyle w:val="Hyperlink"/>
@@ -43581,8 +44006,8 @@
         <w:t xml:space="preserve">.</w:t>
       </w:r>
     </w:p>
-    <w:bookmarkEnd w:id="203"/>
-    <w:bookmarkStart w:id="204" w:name="ref-lin2024awq"/>
+    <w:bookmarkEnd w:id="206"/>
+    <w:bookmarkStart w:id="207" w:name="ref-lin2024awq"/>
     <w:p>
       <w:pPr>
         <w:pStyle w:val="Bibliography"/>
@@ -43622,8 +44047,8 @@
         <w:t xml:space="preserve">.</w:t>
       </w:r>
     </w:p>
-    <w:bookmarkEnd w:id="204"/>
-    <w:bookmarkStart w:id="206" w:name="ref-liu2024lost"/>
+    <w:bookmarkEnd w:id="207"/>
+    <w:bookmarkStart w:id="209" w:name="ref-liu2024lost"/>
     <w:p>
       <w:pPr>
         <w:pStyle w:val="Bibliography"/>
@@ -43662,7 +44087,7 @@
       <w:r>
         <w:t xml:space="preserve"> </w:t>
       </w:r>
-      <w:hyperlink r:id="rId205">
+      <w:hyperlink r:id="rId208">
         <w:r>
           <w:rPr>
             <w:rStyle w:val="Hyperlink"/>
@@ -43674,8 +44099,8 @@
         <w:t xml:space="preserve">.</w:t>
       </w:r>
     </w:p>
-    <w:bookmarkEnd w:id="206"/>
-    <w:bookmarkStart w:id="207" w:name="ref-lu2024bm25s"/>
+    <w:bookmarkEnd w:id="209"/>
+    <w:bookmarkStart w:id="210" w:name="ref-lu2024bm25s"/>
     <w:p>
       <w:pPr>
         <w:pStyle w:val="Bibliography"/>
@@ -43702,8 +44127,8 @@
         <w:t xml:space="preserve">arXiv preprint arXiv:2407.03618.</w:t>
       </w:r>
     </w:p>
-    <w:bookmarkEnd w:id="207"/>
-    <w:bookmarkStart w:id="209" w:name="ref-lyu2025crud"/>
+    <w:bookmarkEnd w:id="210"/>
+    <w:bookmarkStart w:id="212" w:name="ref-lyu2025crud"/>
     <w:p>
       <w:pPr>
         <w:pStyle w:val="Bibliography"/>
@@ -43742,7 +44167,7 @@
       <w:r>
         <w:t xml:space="preserve"> </w:t>
       </w:r>
-      <w:hyperlink r:id="rId208">
+      <w:hyperlink r:id="rId211">
         <w:r>
           <w:rPr>
             <w:rStyle w:val="Hyperlink"/>
@@ -43754,8 +44179,8 @@
         <w:t xml:space="preserve">.</w:t>
       </w:r>
     </w:p>
-    <w:bookmarkEnd w:id="209"/>
-    <w:bookmarkStart w:id="211" w:name="ref-malkov2020hnsw"/>
+    <w:bookmarkEnd w:id="212"/>
+    <w:bookmarkStart w:id="214" w:name="ref-malkov2020hnsw"/>
     <w:p>
       <w:pPr>
         <w:pStyle w:val="Bibliography"/>
@@ -43794,7 +44219,7 @@
       <w:r>
         <w:t xml:space="preserve"> </w:t>
       </w:r>
-      <w:hyperlink r:id="rId210">
+      <w:hyperlink r:id="rId213">
         <w:r>
           <w:rPr>
             <w:rStyle w:val="Hyperlink"/>
@@ -43806,8 +44231,8 @@
         <w:t xml:space="preserve">.</w:t>
       </w:r>
     </w:p>
-    <w:bookmarkEnd w:id="211"/>
-    <w:bookmarkStart w:id="212" w:name="ref-mathur2026policy"/>
+    <w:bookmarkEnd w:id="214"/>
+    <w:bookmarkStart w:id="215" w:name="ref-mathur2026policy"/>
     <w:p>
       <w:pPr>
         <w:pStyle w:val="Bibliography"/>
@@ -43834,8 +44259,8 @@
         <w:t xml:space="preserve">arXiv preprint arXiv:2603.24580.</w:t>
       </w:r>
     </w:p>
-    <w:bookmarkEnd w:id="212"/>
-    <w:bookmarkStart w:id="214" w:name="ref-mcnemar1947"/>
+    <w:bookmarkEnd w:id="215"/>
+    <w:bookmarkStart w:id="217" w:name="ref-mcnemar1947"/>
     <w:p>
       <w:pPr>
         <w:pStyle w:val="Bibliography"/>
@@ -43874,7 +44299,7 @@
       <w:r>
         <w:t xml:space="preserve"> </w:t>
       </w:r>
-      <w:hyperlink r:id="rId213">
+      <w:hyperlink r:id="rId216">
         <w:r>
           <w:rPr>
             <w:rStyle w:val="Hyperlink"/>
@@ -43886,8 +44311,8 @@
         <w:t xml:space="preserve">.</w:t>
       </w:r>
     </w:p>
-    <w:bookmarkEnd w:id="214"/>
-    <w:bookmarkStart w:id="215" w:name="ref-medrano2026fusion"/>
+    <w:bookmarkEnd w:id="217"/>
+    <w:bookmarkStart w:id="218" w:name="ref-medrano2026fusion"/>
     <w:p>
       <w:pPr>
         <w:pStyle w:val="Bibliography"/>
@@ -43914,8 +44339,8 @@
         <w:t xml:space="preserve">arXiv preprint arXiv:2603.02153.</w:t>
       </w:r>
     </w:p>
-    <w:bookmarkEnd w:id="215"/>
-    <w:bookmarkStart w:id="217" w:name="ref-muennighoff2023mteb"/>
+    <w:bookmarkEnd w:id="218"/>
+    <w:bookmarkStart w:id="220" w:name="ref-muennighoff2023mteb"/>
     <w:p>
       <w:pPr>
         <w:pStyle w:val="Bibliography"/>
@@ -43957,7 +44382,7 @@
       <w:r>
         <w:t xml:space="preserve"> </w:t>
       </w:r>
-      <w:hyperlink r:id="rId216">
+      <w:hyperlink r:id="rId219">
         <w:r>
           <w:rPr>
             <w:rStyle w:val="Hyperlink"/>
@@ -43969,8 +44394,8 @@
         <w:t xml:space="preserve">.</w:t>
       </w:r>
     </w:p>
-    <w:bookmarkEnd w:id="217"/>
-    <w:bookmarkStart w:id="218" w:name="ref-muthyam2026systems"/>
+    <w:bookmarkEnd w:id="220"/>
+    <w:bookmarkStart w:id="221" w:name="ref-muthyam2026systems"/>
     <w:p>
       <w:pPr>
         <w:pStyle w:val="Bibliography"/>
@@ -43997,8 +44422,8 @@
         <w:t xml:space="preserve">arXiv preprint arXiv:2606.28337.</w:t>
       </w:r>
     </w:p>
-    <w:bookmarkEnd w:id="218"/>
-    <w:bookmarkStart w:id="219" w:name="ref-nogueira2019passage"/>
+    <w:bookmarkEnd w:id="221"/>
+    <w:bookmarkStart w:id="222" w:name="ref-nogueira2019passage"/>
     <w:p>
       <w:pPr>
         <w:pStyle w:val="Bibliography"/>
@@ -44025,8 +44450,8 @@
         <w:t xml:space="preserve">arXiv preprint arXiv:1901.04085.</w:t>
       </w:r>
     </w:p>
-    <w:bookmarkEnd w:id="219"/>
-    <w:bookmarkStart w:id="221" w:name="ref-peng2026neocorrag"/>
+    <w:bookmarkEnd w:id="222"/>
+    <w:bookmarkStart w:id="224" w:name="ref-peng2026neocorrag"/>
     <w:p>
       <w:pPr>
         <w:pStyle w:val="Bibliography"/>
@@ -44068,7 +44493,7 @@
       <w:r>
         <w:t xml:space="preserve"> </w:t>
       </w:r>
-      <w:hyperlink r:id="rId220">
+      <w:hyperlink r:id="rId223">
         <w:r>
           <w:rPr>
             <w:rStyle w:val="Hyperlink"/>
@@ -44080,8 +44505,8 @@
         <w:t xml:space="preserve">.</w:t>
       </w:r>
     </w:p>
-    <w:bookmarkEnd w:id="221"/>
-    <w:bookmarkStart w:id="223" w:name="ref-petroni2021kilt"/>
+    <w:bookmarkEnd w:id="224"/>
+    <w:bookmarkStart w:id="226" w:name="ref-petroni2021kilt"/>
     <w:p>
       <w:pPr>
         <w:pStyle w:val="Bibliography"/>
@@ -44123,7 +44548,7 @@
       <w:r>
         <w:t xml:space="preserve"> </w:t>
       </w:r>
-      <w:hyperlink r:id="rId222">
+      <w:hyperlink r:id="rId225">
         <w:r>
           <w:rPr>
             <w:rStyle w:val="Hyperlink"/>
@@ -44135,8 +44560,8 @@
         <w:t xml:space="preserve">.</w:t>
       </w:r>
     </w:p>
-    <w:bookmarkEnd w:id="223"/>
-    <w:bookmarkStart w:id="224" w:name="ref-qwen2025qwen25"/>
+    <w:bookmarkEnd w:id="226"/>
+    <w:bookmarkStart w:id="227" w:name="ref-qwen2025qwen25"/>
     <w:p>
       <w:pPr>
         <w:pStyle w:val="Bibliography"/>
@@ -44163,8 +44588,8 @@
         <w:t xml:space="preserve">arXiv preprint arXiv:2412.15115.</w:t>
       </w:r>
     </w:p>
-    <w:bookmarkEnd w:id="224"/>
-    <w:bookmarkStart w:id="226" w:name="ref-ram2023incontext"/>
+    <w:bookmarkEnd w:id="227"/>
+    <w:bookmarkStart w:id="229" w:name="ref-ram2023incontext"/>
     <w:p>
       <w:pPr>
         <w:pStyle w:val="Bibliography"/>
@@ -44203,7 +44628,7 @@
       <w:r>
         <w:t xml:space="preserve"> </w:t>
       </w:r>
-      <w:hyperlink r:id="rId225">
+      <w:hyperlink r:id="rId228">
         <w:r>
           <w:rPr>
             <w:rStyle w:val="Hyperlink"/>
@@ -44215,8 +44640,8 @@
         <w:t xml:space="preserve">.</w:t>
       </w:r>
     </w:p>
-    <w:bookmarkEnd w:id="226"/>
-    <w:bookmarkStart w:id="228" w:name="ref-rau2024bergen"/>
+    <w:bookmarkEnd w:id="229"/>
+    <w:bookmarkStart w:id="231" w:name="ref-rau2024bergen"/>
     <w:p>
       <w:pPr>
         <w:pStyle w:val="Bibliography"/>
@@ -44258,7 +44683,7 @@
       <w:r>
         <w:t xml:space="preserve"> </w:t>
       </w:r>
-      <w:hyperlink r:id="rId227">
+      <w:hyperlink r:id="rId230">
         <w:r>
           <w:rPr>
             <w:rStyle w:val="Hyperlink"/>
@@ -44270,8 +44695,8 @@
         <w:t xml:space="preserve">.</w:t>
       </w:r>
     </w:p>
-    <w:bookmarkEnd w:id="228"/>
-    <w:bookmarkStart w:id="230" w:name="ref-reimers2019sbert"/>
+    <w:bookmarkEnd w:id="231"/>
+    <w:bookmarkStart w:id="233" w:name="ref-reimers2019sbert"/>
     <w:p>
       <w:pPr>
         <w:pStyle w:val="Bibliography"/>
@@ -44313,7 +44738,7 @@
       <w:r>
         <w:t xml:space="preserve"> </w:t>
       </w:r>
-      <w:hyperlink r:id="rId229">
+      <w:hyperlink r:id="rId232">
         <w:r>
           <w:rPr>
             <w:rStyle w:val="Hyperlink"/>
@@ -44325,8 +44750,8 @@
         <w:t xml:space="preserve">.</w:t>
       </w:r>
     </w:p>
-    <w:bookmarkEnd w:id="230"/>
-    <w:bookmarkStart w:id="231" w:name="ref-repantis2026competition"/>
+    <w:bookmarkEnd w:id="233"/>
+    <w:bookmarkStart w:id="234" w:name="ref-repantis2026competition"/>
     <w:p>
       <w:pPr>
         <w:pStyle w:val="Bibliography"/>
@@ -44353,8 +44778,8 @@
         <w:t xml:space="preserve">arXiv preprint arXiv:2605.27294.</w:t>
       </w:r>
     </w:p>
-    <w:bookmarkEnd w:id="231"/>
-    <w:bookmarkStart w:id="233" w:name="ref-robertson2009bm25"/>
+    <w:bookmarkEnd w:id="234"/>
+    <w:bookmarkStart w:id="236" w:name="ref-robertson2009bm25"/>
     <w:p>
       <w:pPr>
         <w:pStyle w:val="Bibliography"/>
@@ -44393,7 +44818,7 @@
       <w:r>
         <w:t xml:space="preserve"> </w:t>
       </w:r>
-      <w:hyperlink r:id="rId232">
+      <w:hyperlink r:id="rId235">
         <w:r>
           <w:rPr>
             <w:rStyle w:val="Hyperlink"/>
@@ -44405,8 +44830,8 @@
         <w:t xml:space="preserve">.</w:t>
       </w:r>
     </w:p>
-    <w:bookmarkEnd w:id="233"/>
-    <w:bookmarkStart w:id="235" w:name="ref-saadfalcon2024ares"/>
+    <w:bookmarkEnd w:id="236"/>
+    <w:bookmarkStart w:id="238" w:name="ref-saadfalcon2024ares"/>
     <w:p>
       <w:pPr>
         <w:pStyle w:val="Bibliography"/>
@@ -44448,7 +44873,7 @@
       <w:r>
         <w:t xml:space="preserve"> </w:t>
       </w:r>
-      <w:hyperlink r:id="rId234">
+      <w:hyperlink r:id="rId237">
         <w:r>
           <w:rPr>
             <w:rStyle w:val="Hyperlink"/>
@@ -44460,8 +44885,8 @@
         <w:t xml:space="preserve">.</w:t>
       </w:r>
     </w:p>
-    <w:bookmarkEnd w:id="235"/>
-    <w:bookmarkStart w:id="237" w:name="ref-sakai2014"/>
+    <w:bookmarkEnd w:id="238"/>
+    <w:bookmarkStart w:id="240" w:name="ref-sakai2014"/>
     <w:p>
       <w:pPr>
         <w:pStyle w:val="Bibliography"/>
@@ -44500,7 +44925,7 @@
       <w:r>
         <w:t xml:space="preserve"> </w:t>
       </w:r>
-      <w:hyperlink r:id="rId236">
+      <w:hyperlink r:id="rId239">
         <w:r>
           <w:rPr>
             <w:rStyle w:val="Hyperlink"/>
@@ -44512,8 +44937,8 @@
         <w:t xml:space="preserve">.</w:t>
       </w:r>
     </w:p>
-    <w:bookmarkEnd w:id="237"/>
-    <w:bookmarkStart w:id="239" w:name="ref-salemi2024erag"/>
+    <w:bookmarkEnd w:id="240"/>
+    <w:bookmarkStart w:id="242" w:name="ref-salemi2024erag"/>
     <w:p>
       <w:pPr>
         <w:pStyle w:val="Bibliography"/>
@@ -44555,7 +44980,7 @@
       <w:r>
         <w:t xml:space="preserve"> </w:t>
       </w:r>
-      <w:hyperlink r:id="rId238">
+      <w:hyperlink r:id="rId241">
         <w:r>
           <w:rPr>
             <w:rStyle w:val="Hyperlink"/>
@@ -44567,8 +44992,8 @@
         <w:t xml:space="preserve">.</w:t>
       </w:r>
     </w:p>
-    <w:bookmarkEnd w:id="239"/>
-    <w:bookmarkStart w:id="241" w:name="ref-samuel2026beyond"/>
+    <w:bookmarkEnd w:id="242"/>
+    <w:bookmarkStart w:id="244" w:name="ref-samuel2026beyond"/>
     <w:p>
       <w:pPr>
         <w:pStyle w:val="Bibliography"/>
@@ -44610,7 +45035,7 @@
       <w:r>
         <w:t xml:space="preserve"> </w:t>
       </w:r>
-      <w:hyperlink r:id="rId240">
+      <w:hyperlink r:id="rId243">
         <w:r>
           <w:rPr>
             <w:rStyle w:val="Hyperlink"/>
@@ -44622,8 +45047,8 @@
         <w:t xml:space="preserve">.</w:t>
       </w:r>
     </w:p>
-    <w:bookmarkEnd w:id="241"/>
-    <w:bookmarkStart w:id="242" w:name="ref-shi2023distracted"/>
+    <w:bookmarkEnd w:id="244"/>
+    <w:bookmarkStart w:id="245" w:name="ref-shi2023distracted"/>
     <w:p>
       <w:pPr>
         <w:pStyle w:val="Bibliography"/>
@@ -44663,8 +45088,8 @@
         <w:t xml:space="preserve">, 202:31210–27. PMLR.</w:t>
       </w:r>
     </w:p>
-    <w:bookmarkEnd w:id="242"/>
-    <w:bookmarkStart w:id="244" w:name="ref-smucker2007"/>
+    <w:bookmarkEnd w:id="245"/>
+    <w:bookmarkStart w:id="247" w:name="ref-smucker2007"/>
     <w:p>
       <w:pPr>
         <w:pStyle w:val="Bibliography"/>
@@ -44706,7 +45131,7 @@
       <w:r>
         <w:t xml:space="preserve"> </w:t>
       </w:r>
-      <w:hyperlink r:id="rId243">
+      <w:hyperlink r:id="rId246">
         <w:r>
           <w:rPr>
             <w:rStyle w:val="Hyperlink"/>
@@ -44718,8 +45143,8 @@
         <w:t xml:space="preserve">.</w:t>
       </w:r>
     </w:p>
-    <w:bookmarkEnd w:id="244"/>
-    <w:bookmarkStart w:id="245" w:name="ref-thakur2021beir"/>
+    <w:bookmarkEnd w:id="247"/>
+    <w:bookmarkStart w:id="248" w:name="ref-thakur2021beir"/>
     <w:p>
       <w:pPr>
         <w:pStyle w:val="Bibliography"/>
@@ -44759,8 +45184,8 @@
         <w:t xml:space="preserve">.</w:t>
       </w:r>
     </w:p>
-    <w:bookmarkEnd w:id="245"/>
-    <w:bookmarkStart w:id="246" w:name="ref-trappolini2025udcg"/>
+    <w:bookmarkEnd w:id="248"/>
+    <w:bookmarkStart w:id="249" w:name="ref-trappolini2025udcg"/>
     <w:p>
       <w:pPr>
         <w:pStyle w:val="Bibliography"/>
@@ -44787,8 +45212,8 @@
         <w:t xml:space="preserve">arXiv preprint arXiv:2510.21440.</w:t>
       </w:r>
     </w:p>
-    <w:bookmarkEnd w:id="246"/>
-    <w:bookmarkStart w:id="247" w:name="ref-wang2022e5"/>
+    <w:bookmarkEnd w:id="249"/>
+    <w:bookmarkStart w:id="250" w:name="ref-wang2022e5"/>
     <w:p>
       <w:pPr>
         <w:pStyle w:val="Bibliography"/>
@@ -44815,8 +45240,8 @@
         <w:t xml:space="preserve">arXiv preprint arXiv:2212.03533.</w:t>
       </w:r>
     </w:p>
-    <w:bookmarkEnd w:id="247"/>
-    <w:bookmarkStart w:id="248" w:name="ref-wang2020minilm"/>
+    <w:bookmarkEnd w:id="250"/>
+    <w:bookmarkStart w:id="251" w:name="ref-wang2020minilm"/>
     <w:p>
       <w:pPr>
         <w:pStyle w:val="Bibliography"/>
@@ -44856,8 +45281,8 @@
         <w:t xml:space="preserve">.</w:t>
       </w:r>
     </w:p>
-    <w:bookmarkEnd w:id="248"/>
-    <w:bookmarkStart w:id="250" w:name="ref-xiao2024cpack"/>
+    <w:bookmarkEnd w:id="251"/>
+    <w:bookmarkStart w:id="253" w:name="ref-xiao2024cpack"/>
     <w:p>
       <w:pPr>
         <w:pStyle w:val="Bibliography"/>
@@ -44899,7 +45324,7 @@
       <w:r>
         <w:t xml:space="preserve"> </w:t>
       </w:r>
-      <w:hyperlink r:id="rId249">
+      <w:hyperlink r:id="rId252">
         <w:r>
           <w:rPr>
             <w:rStyle w:val="Hyperlink"/>
@@ -44911,8 +45336,8 @@
         <w:t xml:space="preserve">.</w:t>
       </w:r>
     </w:p>
-    <w:bookmarkEnd w:id="250"/>
-    <w:bookmarkStart w:id="252" w:name="ref-yang2018hotpotqa"/>
+    <w:bookmarkEnd w:id="253"/>
+    <w:bookmarkStart w:id="255" w:name="ref-yang2018hotpotqa"/>
     <w:p>
       <w:pPr>
         <w:pStyle w:val="Bibliography"/>
@@ -44954,7 +45379,7 @@
       <w:r>
         <w:t xml:space="preserve"> </w:t>
       </w:r>
-      <w:hyperlink r:id="rId251">
+      <w:hyperlink r:id="rId254">
         <w:r>
           <w:rPr>
             <w:rStyle w:val="Hyperlink"/>
@@ -44966,8 +45391,8 @@
         <w:t xml:space="preserve">.</w:t>
       </w:r>
     </w:p>
-    <w:bookmarkEnd w:id="252"/>
-    <w:bookmarkStart w:id="253" w:name="ref-zhang2025qwen3emb"/>
+    <w:bookmarkEnd w:id="255"/>
+    <w:bookmarkStart w:id="256" w:name="ref-zhang2025qwen3emb"/>
     <w:p>
       <w:pPr>
         <w:pStyle w:val="Bibliography"/>
@@ -44994,8 +45419,8 @@
         <w:t xml:space="preserve">arXiv preprint arXiv:2506.05176.</w:t>
       </w:r>
     </w:p>
-    <w:bookmarkEnd w:id="253"/>
-    <w:bookmarkStart w:id="255" w:name="ref-zhao2026design"/>
+    <w:bookmarkEnd w:id="256"/>
+    <w:bookmarkStart w:id="258" w:name="ref-zhao2026design"/>
     <w:p>
       <w:pPr>
         <w:pStyle w:val="Bibliography"/>
@@ -45031,7 +45456,7 @@
       <w:r>
         <w:t xml:space="preserve"> </w:t>
       </w:r>
-      <w:hyperlink r:id="rId254">
+      <w:hyperlink r:id="rId257">
         <w:r>
           <w:rPr>
             <w:rStyle w:val="Hyperlink"/>
@@ -45043,8 +45468,8 @@
         <w:t xml:space="preserve">.</w:t>
       </w:r>
     </w:p>
-    <w:bookmarkEnd w:id="255"/>
-    <w:bookmarkStart w:id="256" w:name="ref-zheng2023judge"/>
+    <w:bookmarkEnd w:id="258"/>
+    <w:bookmarkStart w:id="259" w:name="ref-zheng2023judge"/>
     <w:p>
       <w:pPr>
         <w:pStyle w:val="Bibliography"/>
@@ -45084,9 +45509,9 @@
         <w:t xml:space="preserve">.</w:t>
       </w:r>
     </w:p>
-    <w:bookmarkEnd w:id="256"/>
-    <w:bookmarkEnd w:id="257"/>
-    <w:bookmarkEnd w:id="258"/>
+    <w:bookmarkEnd w:id="259"/>
+    <w:bookmarkEnd w:id="260"/>
+    <w:bookmarkEnd w:id="261"/>
     <w:sectPr/>
   </w:body>
 </w:document>

</xml_diff>

<commit_message>
Reference check of all 61 citations; bib details from sources (Amiraz pages, Leto venue, Hitl pages, Landis pages, CRUD-RAG pages removed); 'Bala shows'
</commit_message>
<xml_diff>
--- a/manuscript_ipm/revision_v04/latex/manuscript.docx
+++ b/manuscript_ipm/revision_v04/latex/manuscript.docx
@@ -2719,7 +2719,7 @@
         <w:t xml:space="preserve"> </w:t>
       </w:r>
       <w:r>
-        <w:t xml:space="preserve">show that recall of the retrieved set can differ from what reaches the reader once a context budget forces truncation.</w:t>
+        <w:t xml:space="preserve">shows that recall of the retrieved set can differ from what reaches the reader once a context budget forces truncation.</w:t>
       </w:r>
     </w:p>
     <w:bookmarkEnd w:id="22"/>
@@ -42830,7 +42830,7 @@
         <w:t xml:space="preserve">Proceedings of the 63rd Annual Meeting of the Association for Computational Linguistics (ACL 2025)</w:t>
       </w:r>
       <w:r>
-        <w:t xml:space="preserve">.</w:t>
+        <w:t xml:space="preserve">, 18228–58.</w:t>
       </w:r>
       <w:r>
         <w:t xml:space="preserve"> </w:t>
@@ -43294,7 +43294,7 @@
         <w:t xml:space="preserve">Data Technologies and Applications</w:t>
       </w:r>
       <w:r>
-        <w:t xml:space="preserve">.</w:t>
+        <w:t xml:space="preserve">, 1–19.</w:t>
       </w:r>
       <w:r>
         <w:t xml:space="preserve"> </w:t>
@@ -43813,7 +43813,7 @@
         <w:t xml:space="preserve"> </w:t>
       </w:r>
       <w:r>
-        <w:t xml:space="preserve">33 (1): 159.</w:t>
+        <w:t xml:space="preserve">33 (1): 159–74.</w:t>
       </w:r>
       <w:r>
         <w:t xml:space="preserve"> </w:t>
@@ -43910,7 +43910,7 @@
         <w:t xml:space="preserve"> </w:t>
       </w:r>
       <w:r>
-        <w:t xml:space="preserve">arXiv preprint arXiv:2411.07396.</w:t>
+        <w:t xml:space="preserve">NeurIPS 2024 Workshop on Attributing Model Behavior at Scale (ATTRIB); arXiv preprint arXiv:2411.07396.</w:t>
       </w:r>
     </w:p>
     <w:bookmarkEnd w:id="203"/>
@@ -44162,7 +44162,7 @@
         <w:t xml:space="preserve"> </w:t>
       </w:r>
       <w:r>
-        <w:t xml:space="preserve">43 (2): 1–32.</w:t>
+        <w:t xml:space="preserve">43 (2).</w:t>
       </w:r>
       <w:r>
         <w:t xml:space="preserve"> </w:t>

</xml_diff>

<commit_message>
v0.7: scope full-corpus claim in abstract, highlight and introduction; record check of external review prompt
</commit_message>
<xml_diff>
--- a/manuscript_ipm/revision_v04/latex/manuscript.docx
+++ b/manuscript_ipm/revision_v04/latex/manuscript.docx
@@ -693,13 +693,25 @@
         <w:t xml:space="preserve"> </w:t>
       </w:r>
       <w:r>
-        <w:t xml:space="preserve">the</w:t>
-      </w:r>
-      <w:r>
-        <w:t xml:space="preserve"> </w:t>
-      </w:r>
-      <w:r>
-        <w:t xml:space="preserve">dense</w:t>
+        <w:t xml:space="preserve">bge-small</w:t>
+      </w:r>
+      <w:r>
+        <w:t xml:space="preserve"> </w:t>
+      </w:r>
+      <w:r>
+        <w:t xml:space="preserve">and</w:t>
+      </w:r>
+      <w:r>
+        <w:t xml:space="preserve"> </w:t>
+      </w:r>
+      <w:r>
+        <w:t xml:space="preserve">e5-base-v2</w:t>
+      </w:r>
+      <w:r>
+        <w:t xml:space="preserve"> </w:t>
+      </w:r>
+      <w:r>
+        <w:t xml:space="preserve">had</w:t>
       </w:r>
       <w:r>
         <w:t xml:space="preserve"> </w:t>
@@ -711,7 +723,7 @@
         <w:t xml:space="preserve"> </w:t>
       </w:r>
       <w:r>
-        <w:t xml:space="preserve">were</w:t>
+        <w:t xml:space="preserve">of</w:t>
       </w:r>
       <w:r>
         <w:t xml:space="preserve"> </w:t>
@@ -747,18 +759,6 @@
         <w:t xml:space="preserve"> </w:t>
       </w:r>
       <w:r>
-        <w:t xml:space="preserve">those</w:t>
-      </w:r>
-      <w:r>
-        <w:t xml:space="preserve"> </w:t>
-      </w:r>
-      <w:r>
-        <w:t xml:space="preserve">of</w:t>
-      </w:r>
-      <w:r>
-        <w:t xml:space="preserve"> </w:t>
-      </w:r>
-      <w:r>
         <w:t xml:space="preserve">e5-base-v2</w:t>
       </w:r>
       <w:r>
@@ -777,7 +777,7 @@
         <w:t xml:space="preserve"> </w:t>
       </w:r>
       <w:r>
-        <w:t xml:space="preserve">their</w:t>
+        <w:t xml:space="preserve">its</w:t>
       </w:r>
       <w:r>
         <w:t xml:space="preserve"> </w:t>
@@ -2092,7 +2092,7 @@
         </w:numPr>
       </w:pPr>
       <w:r>
-        <w:t xml:space="preserve">Paired estimates of the answer gain per unit of retrieval gain for six retrievers, two readers and two datasets, with bootstrap intervals and a reporting rule fixed in advance, their sensitivity to the answer metric, the baseline, the retrieval metric and the number of passages read, and a registered replication of the NQ ratios on the full corpus (Sections </w:t>
+        <w:t xml:space="preserve">Paired estimates of the answer gain per unit of retrieval gain for six retrievers, two readers and two datasets, with bootstrap intervals and a reporting rule fixed in advance, their sensitivity to the answer metric, the baseline, the retrieval metric and the number of passages read, and a registered full-corpus replication of the NQ ratios for two dense encoders (Sections </w:t>
       </w:r>
       <w:hyperlink w:anchor="sec:res-transfer">
         <w:r>

</xml_diff>

<commit_message>
Submission package for IP&M; ORCID on title page; ethics statement names the miss audit
</commit_message>
<xml_diff>
--- a/manuscript_ipm/revision_v04/latex/manuscript.docx
+++ b/manuscript_ipm/revision_v04/latex/manuscript.docx
@@ -24155,7 +24155,18 @@
         <w:pStyle w:val="FirstParagraph"/>
       </w:pPr>
       <w:r>
-        <w:t xml:space="preserve">The 200 judge-validation items were labelled by one member of the study team, with the same instructions the judge received and without seeing its verdicts. No external participants were involved.</w:t>
+        <w:t xml:space="preserve">The 200 judge-validation items were labelled by one member of the study team, with the same instructions the judge received and without seeing its verdicts. The same person labelled the 100 audited retrieval misses, blinded as described in Section </w:t>
+      </w:r>
+      <w:hyperlink w:anchor="sec:res-decomp">
+        <w:r>
+          <w:rPr>
+            <w:rStyle w:val="Hyperlink"/>
+          </w:rPr>
+          <w:t xml:space="preserve">5.5</w:t>
+        </w:r>
+      </w:hyperlink>
+      <w:r>
+        <w:t xml:space="preserve">. No external participants were involved.</w:t>
       </w:r>
     </w:p>
     <w:bookmarkEnd w:id="136"/>

</xml_diff>